<commit_message>
Отчет(ДКР) ЛАБА 3 FULL COMPLETED; UPDATE practice_report
</commit_message>
<xml_diff>
--- a/practice_report/УП06 Шильников Максим Юрьевич.docx
+++ b/practice_report/УП06 Шильников Максим Юрьевич.docx
@@ -261,8 +261,22 @@
           <w:vertAlign w:val="superscript"/>
           <w:lang w:eastAsia="ru-RU"/>
         </w:rPr>
-        <w:t xml:space="preserve">(должность,   </w:t>
-      </w:r>
+        <w:t>(</w:t>
+      </w:r>
+      <w:proofErr w:type="gramStart"/>
+      <w:r>
+        <w:rPr>
+          <w:rFonts w:ascii="Times New Roman" w:eastAsia="Times New Roman" w:hAnsi="Times New Roman" w:cs="Times New Roman"/>
+          <w:i/>
+          <w:color w:val="000000"/>
+          <w:sz w:val="24"/>
+          <w:szCs w:val="24"/>
+          <w:vertAlign w:val="superscript"/>
+          <w:lang w:eastAsia="ru-RU"/>
+        </w:rPr>
+        <w:t xml:space="preserve">должность,   </w:t>
+      </w:r>
+      <w:proofErr w:type="gramEnd"/>
       <w:r>
         <w:rPr>
           <w:rFonts w:ascii="Times New Roman" w:eastAsia="Times New Roman" w:hAnsi="Times New Roman" w:cs="Times New Roman"/>
@@ -388,7 +402,29 @@
           <w:szCs w:val="24"/>
           <w:lang w:eastAsia="ru-RU"/>
         </w:rPr>
-        <w:t>Дата « __» ____________ 202_ год</w:t>
+        <w:t xml:space="preserve">Дата </w:t>
+      </w:r>
+      <w:proofErr w:type="gramStart"/>
+      <w:r>
+        <w:rPr>
+          <w:rFonts w:ascii="Times New Roman" w:eastAsia="Times New Roman" w:hAnsi="Times New Roman" w:cs="Times New Roman"/>
+          <w:color w:val="000000"/>
+          <w:sz w:val="24"/>
+          <w:szCs w:val="24"/>
+          <w:lang w:eastAsia="ru-RU"/>
+        </w:rPr>
+        <w:t>« _</w:t>
+      </w:r>
+      <w:proofErr w:type="gramEnd"/>
+      <w:r>
+        <w:rPr>
+          <w:rFonts w:ascii="Times New Roman" w:eastAsia="Times New Roman" w:hAnsi="Times New Roman" w:cs="Times New Roman"/>
+          <w:color w:val="000000"/>
+          <w:sz w:val="24"/>
+          <w:szCs w:val="24"/>
+          <w:lang w:eastAsia="ru-RU"/>
+        </w:rPr>
+        <w:t>_» ____________ 202_ год</w:t>
       </w:r>
     </w:p>
     <w:p>
@@ -945,8 +981,18 @@
                 <w:sz w:val="24"/>
                 <w:szCs w:val="24"/>
               </w:rPr>
-              <w:t>Колледж ВятГУ</w:t>
+              <w:t xml:space="preserve">Колледж </w:t>
             </w:r>
+            <w:proofErr w:type="spellStart"/>
+            <w:r>
+              <w:rPr>
+                <w:rFonts w:ascii="Times New Roman" w:hAnsi="Times New Roman" w:cs="Times New Roman"/>
+                <w:sz w:val="24"/>
+                <w:szCs w:val="24"/>
+              </w:rPr>
+              <w:t>ВятГУ</w:t>
+            </w:r>
+            <w:proofErr w:type="spellEnd"/>
           </w:p>
         </w:tc>
         <w:tc>
@@ -3521,7 +3567,43 @@
           <w:sz w:val="28"/>
           <w:szCs w:val="28"/>
         </w:rPr>
-        <w:t>(дата)                       (подпись)</w:t>
+        <w:t>(</w:t>
+      </w:r>
+      <w:proofErr w:type="gramStart"/>
+      <w:r>
+        <w:rPr>
+          <w:rFonts w:ascii="Times New Roman" w:hAnsi="Times New Roman" w:cs="Times New Roman"/>
+          <w:sz w:val="28"/>
+          <w:szCs w:val="28"/>
+        </w:rPr>
+        <w:t xml:space="preserve">дата)   </w:t>
+      </w:r>
+      <w:proofErr w:type="gramEnd"/>
+      <w:r>
+        <w:rPr>
+          <w:rFonts w:ascii="Times New Roman" w:hAnsi="Times New Roman" w:cs="Times New Roman"/>
+          <w:sz w:val="28"/>
+          <w:szCs w:val="28"/>
+        </w:rPr>
+        <w:t xml:space="preserve">                 </w:t>
+      </w:r>
+      <w:proofErr w:type="gramStart"/>
+      <w:r>
+        <w:rPr>
+          <w:rFonts w:ascii="Times New Roman" w:hAnsi="Times New Roman" w:cs="Times New Roman"/>
+          <w:sz w:val="28"/>
+          <w:szCs w:val="28"/>
+        </w:rPr>
+        <w:t xml:space="preserve">   (</w:t>
+      </w:r>
+      <w:proofErr w:type="gramEnd"/>
+      <w:r>
+        <w:rPr>
+          <w:rFonts w:ascii="Times New Roman" w:hAnsi="Times New Roman" w:cs="Times New Roman"/>
+          <w:sz w:val="28"/>
+          <w:szCs w:val="28"/>
+        </w:rPr>
+        <w:t>подпись)</w:t>
       </w:r>
     </w:p>
     <w:p>
@@ -3607,7 +3689,61 @@
           <w:sz w:val="28"/>
           <w:szCs w:val="28"/>
         </w:rPr>
-        <w:t xml:space="preserve"> среду разработки (IDE) PyCharm. Python — это язык с очень простым и понятным синтаксисом, что делает его идеальным для начинающих. PyCharm предоставляет все необходимые инструменты в одном окне: умное редактирование кода с подсказками, встроенный отладчик для пошагового выполнения программы и нахождения ошибок, а также систему управления версиями Git. </w:t>
+        <w:t xml:space="preserve"> среду разработки (IDE) </w:t>
+      </w:r>
+      <w:proofErr w:type="spellStart"/>
+      <w:r>
+        <w:rPr>
+          <w:rFonts w:ascii="Times New Roman" w:hAnsi="Times New Roman" w:cs="Times New Roman"/>
+          <w:sz w:val="28"/>
+          <w:szCs w:val="28"/>
+        </w:rPr>
+        <w:t>PyCharm</w:t>
+      </w:r>
+      <w:proofErr w:type="spellEnd"/>
+      <w:r>
+        <w:rPr>
+          <w:rFonts w:ascii="Times New Roman" w:hAnsi="Times New Roman" w:cs="Times New Roman"/>
+          <w:sz w:val="28"/>
+          <w:szCs w:val="28"/>
+        </w:rPr>
+        <w:t xml:space="preserve">. Python — это язык с очень простым и понятным синтаксисом, что делает его идеальным для начинающих. </w:t>
+      </w:r>
+      <w:proofErr w:type="spellStart"/>
+      <w:r>
+        <w:rPr>
+          <w:rFonts w:ascii="Times New Roman" w:hAnsi="Times New Roman" w:cs="Times New Roman"/>
+          <w:sz w:val="28"/>
+          <w:szCs w:val="28"/>
+        </w:rPr>
+        <w:t>PyCharm</w:t>
+      </w:r>
+      <w:proofErr w:type="spellEnd"/>
+      <w:r>
+        <w:rPr>
+          <w:rFonts w:ascii="Times New Roman" w:hAnsi="Times New Roman" w:cs="Times New Roman"/>
+          <w:sz w:val="28"/>
+          <w:szCs w:val="28"/>
+        </w:rPr>
+        <w:t xml:space="preserve"> предоставляет все необходимые инструменты в одном окне: умное редактирование кода с подсказками, встроенный отладчик для пошагового выполнения программы и нахождения ошибок, а также систему управления версиями </w:t>
+      </w:r>
+      <w:proofErr w:type="spellStart"/>
+      <w:r>
+        <w:rPr>
+          <w:rFonts w:ascii="Times New Roman" w:hAnsi="Times New Roman" w:cs="Times New Roman"/>
+          <w:sz w:val="28"/>
+          <w:szCs w:val="28"/>
+        </w:rPr>
+        <w:t>Git</w:t>
+      </w:r>
+      <w:proofErr w:type="spellEnd"/>
+      <w:r>
+        <w:rPr>
+          <w:rFonts w:ascii="Times New Roman" w:hAnsi="Times New Roman" w:cs="Times New Roman"/>
+          <w:sz w:val="28"/>
+          <w:szCs w:val="28"/>
+        </w:rPr>
+        <w:t xml:space="preserve">. </w:t>
       </w:r>
       <w:r>
         <w:rPr>
@@ -3779,7 +3915,25 @@
           <w:sz w:val="28"/>
           <w:szCs w:val="28"/>
         </w:rPr>
-        <w:t xml:space="preserve"> ниже, показан интерфейс PyCharm с открытым проектом, где слева находится структура файлов, в центре — код с подсветкой синтаксиса, а снизу — окно для вывода результатов и работы с терминалом.</w:t>
+        <w:t xml:space="preserve"> ниже, показан интерфейс </w:t>
+      </w:r>
+      <w:proofErr w:type="spellStart"/>
+      <w:r>
+        <w:rPr>
+          <w:rFonts w:ascii="Times New Roman" w:hAnsi="Times New Roman" w:cs="Times New Roman"/>
+          <w:sz w:val="28"/>
+          <w:szCs w:val="28"/>
+        </w:rPr>
+        <w:t>PyCharm</w:t>
+      </w:r>
+      <w:proofErr w:type="spellEnd"/>
+      <w:r>
+        <w:rPr>
+          <w:rFonts w:ascii="Times New Roman" w:hAnsi="Times New Roman" w:cs="Times New Roman"/>
+          <w:sz w:val="28"/>
+          <w:szCs w:val="28"/>
+        </w:rPr>
+        <w:t xml:space="preserve"> с открытым проектом, где слева находится структура файлов, в центре — код с подсветкой синтаксиса, а снизу — окно для вывода результатов и работы с терминалом.</w:t>
       </w:r>
     </w:p>
     <w:p>
@@ -4809,10 +4963,55 @@
                 <w:rFonts w:ascii="Times New Roman" w:hAnsi="Times New Roman" w:cs="Times New Roman"/>
                 <w:sz w:val="28"/>
                 <w:szCs w:val="28"/>
+                <w:lang w:val="en-US"/>
+              </w:rPr>
+            </w:pPr>
+            <w:r>
+              <w:rPr>
+                <w:rFonts w:ascii="Times New Roman" w:hAnsi="Times New Roman" w:cs="Times New Roman"/>
+                <w:sz w:val="28"/>
+                <w:szCs w:val="28"/>
+                <w:lang w:val="en-US"/>
+              </w:rPr>
+              <w:t>B</w:t>
+            </w:r>
+          </w:p>
+          <w:p>
+            <w:pPr>
+              <w:spacing w:after="0" w:line="240" w:lineRule="auto"/>
+              <w:jc w:val="center"/>
+              <w:rPr>
+                <w:rFonts w:ascii="Times New Roman" w:hAnsi="Times New Roman" w:cs="Times New Roman"/>
+                <w:sz w:val="28"/>
+                <w:szCs w:val="28"/>
                 <w:highlight w:val="yellow"/>
                 <w:lang w:val="en-US"/>
               </w:rPr>
             </w:pPr>
+          </w:p>
+        </w:tc>
+      </w:tr>
+      <w:tr>
+        <w:trPr>
+          <w:trHeight w:val="510"/>
+          <w:jc w:val="center"/>
+        </w:trPr>
+        <w:tc>
+          <w:tcPr>
+            <w:tcW w:w="455" w:type="dxa"/>
+            <w:vAlign w:val="center"/>
+          </w:tcPr>
+          <w:p>
+            <w:pPr>
+              <w:spacing w:after="0" w:line="240" w:lineRule="auto"/>
+              <w:jc w:val="center"/>
+              <w:rPr>
+                <w:rFonts w:ascii="Times New Roman" w:hAnsi="Times New Roman" w:cs="Times New Roman"/>
+                <w:sz w:val="28"/>
+                <w:szCs w:val="28"/>
+                <w:lang w:val="en-US"/>
+              </w:rPr>
+            </w:pPr>
             <w:r>
               <w:rPr>
                 <w:rFonts w:ascii="Times New Roman" w:hAnsi="Times New Roman" w:cs="Times New Roman"/>
@@ -4820,7 +5019,88 @@
                 <w:szCs w:val="28"/>
                 <w:lang w:val="en-US"/>
               </w:rPr>
-              <w:t>B</w:t>
+              <w:t>5</w:t>
+            </w:r>
+          </w:p>
+        </w:tc>
+        <w:tc>
+          <w:tcPr>
+            <w:tcW w:w="1241" w:type="dxa"/>
+            <w:vAlign w:val="center"/>
+          </w:tcPr>
+          <w:p>
+            <w:pPr>
+              <w:spacing w:after="0" w:line="240" w:lineRule="auto"/>
+              <w:jc w:val="center"/>
+              <w:rPr>
+                <w:rFonts w:ascii="Times New Roman" w:hAnsi="Times New Roman" w:cs="Times New Roman"/>
+                <w:sz w:val="28"/>
+                <w:szCs w:val="28"/>
+                <w:lang w:val="en-GB"/>
+              </w:rPr>
+            </w:pPr>
+            <w:r>
+              <w:rPr>
+                <w:rFonts w:ascii="Times New Roman" w:hAnsi="Times New Roman" w:cs="Times New Roman"/>
+                <w:sz w:val="28"/>
+                <w:szCs w:val="28"/>
+                <w:lang w:val="en-GB"/>
+              </w:rPr>
+              <w:t>25.10.25</w:t>
+            </w:r>
+          </w:p>
+        </w:tc>
+        <w:tc>
+          <w:tcPr>
+            <w:tcW w:w="6096" w:type="dxa"/>
+            <w:vAlign w:val="center"/>
+          </w:tcPr>
+          <w:p>
+            <w:pPr>
+              <w:spacing w:after="0" w:line="240" w:lineRule="auto"/>
+              <w:jc w:val="center"/>
+              <w:rPr>
+                <w:rFonts w:ascii="Times New Roman" w:hAnsi="Times New Roman" w:cs="Times New Roman"/>
+                <w:sz w:val="28"/>
+                <w:szCs w:val="28"/>
+                <w:lang w:val="en-US"/>
+              </w:rPr>
+            </w:pPr>
+            <w:r>
+              <w:rPr>
+                <w:rFonts w:ascii="Times New Roman" w:hAnsi="Times New Roman" w:cs="Times New Roman"/>
+                <w:sz w:val="28"/>
+                <w:szCs w:val="28"/>
+                <w:lang w:val="en-US"/>
+              </w:rPr>
+              <w:t>https://codeforces.com/group/PNnJXl1VKU/contest/649430/problem/D</w:t>
+            </w:r>
+          </w:p>
+        </w:tc>
+        <w:tc>
+          <w:tcPr>
+            <w:tcW w:w="1559" w:type="dxa"/>
+            <w:vAlign w:val="center"/>
+          </w:tcPr>
+          <w:p>
+            <w:pPr>
+              <w:spacing w:after="0" w:line="240" w:lineRule="auto"/>
+              <w:jc w:val="center"/>
+              <w:rPr>
+                <w:rFonts w:ascii="Times New Roman" w:hAnsi="Times New Roman" w:cs="Times New Roman"/>
+                <w:sz w:val="28"/>
+                <w:szCs w:val="28"/>
+                <w:lang w:val="en-US"/>
+              </w:rPr>
+            </w:pPr>
+            <w:r>
+              <w:rPr>
+                <w:rFonts w:ascii="Times New Roman" w:hAnsi="Times New Roman" w:cs="Times New Roman"/>
+                <w:sz w:val="28"/>
+                <w:szCs w:val="28"/>
+                <w:lang w:val="en-US"/>
+              </w:rPr>
+              <w:t>D</w:t>
             </w:r>
           </w:p>
         </w:tc>
@@ -4833,6 +5113,7 @@
           <w:b/>
           <w:sz w:val="28"/>
           <w:szCs w:val="28"/>
+          <w:lang w:val="en-GB"/>
         </w:rPr>
       </w:pPr>
       <w:r>
@@ -4841,6 +5122,7 @@
           <w:b/>
           <w:sz w:val="28"/>
           <w:szCs w:val="28"/>
+          <w:lang w:val="en-GB"/>
         </w:rPr>
         <w:br w:type="page" w:clear="all"/>
       </w:r>
@@ -4943,6 +5225,7 @@
         </w:rPr>
         <w:t xml:space="preserve"> </w:t>
       </w:r>
+      <w:proofErr w:type="spellStart"/>
       <w:r>
         <w:rPr>
           <w:rFonts w:ascii="Times New Roman" w:hAnsi="Times New Roman" w:cs="Times New Roman"/>
@@ -4952,6 +5235,7 @@
         </w:rPr>
         <w:t>cstud</w:t>
       </w:r>
+      <w:proofErr w:type="spellEnd"/>
       <w:r>
         <w:rPr>
           <w:rFonts w:ascii="Times New Roman" w:hAnsi="Times New Roman" w:cs="Times New Roman"/>
@@ -5082,6 +5366,7 @@
         </w:rPr>
         <w:t>://</w:t>
       </w:r>
+      <w:proofErr w:type="spellStart"/>
       <w:r>
         <w:rPr>
           <w:rFonts w:ascii="Times New Roman" w:hAnsi="Times New Roman" w:cs="Times New Roman"/>
@@ -5091,6 +5376,7 @@
         </w:rPr>
         <w:t>codeforces</w:t>
       </w:r>
+      <w:proofErr w:type="spellEnd"/>
       <w:r>
         <w:rPr>
           <w:rFonts w:ascii="Times New Roman" w:hAnsi="Times New Roman" w:cs="Times New Roman"/>
@@ -5133,6 +5419,7 @@
         </w:rPr>
         <w:t>/</w:t>
       </w:r>
+      <w:proofErr w:type="spellStart"/>
       <w:r>
         <w:rPr>
           <w:rFonts w:ascii="Times New Roman" w:hAnsi="Times New Roman" w:cs="Times New Roman"/>
@@ -5142,6 +5429,7 @@
         </w:rPr>
         <w:t>PNnJXl</w:t>
       </w:r>
+      <w:proofErr w:type="spellEnd"/>
       <w:r>
         <w:rPr>
           <w:rFonts w:ascii="Times New Roman" w:hAnsi="Times New Roman" w:cs="Times New Roman"/>
@@ -6296,6 +6584,7 @@
         </w:rPr>
         <w:t>://</w:t>
       </w:r>
+      <w:proofErr w:type="spellStart"/>
       <w:r>
         <w:rPr>
           <w:rFonts w:ascii="Times New Roman" w:hAnsi="Times New Roman" w:cs="Times New Roman"/>
@@ -6305,6 +6594,7 @@
         </w:rPr>
         <w:t>codeforces</w:t>
       </w:r>
+      <w:proofErr w:type="spellEnd"/>
       <w:r>
         <w:rPr>
           <w:rFonts w:ascii="Times New Roman" w:hAnsi="Times New Roman" w:cs="Times New Roman"/>
@@ -6347,6 +6637,7 @@
         </w:rPr>
         <w:t>/</w:t>
       </w:r>
+      <w:proofErr w:type="spellStart"/>
       <w:r>
         <w:rPr>
           <w:rFonts w:ascii="Times New Roman" w:hAnsi="Times New Roman" w:cs="Times New Roman"/>
@@ -6356,6 +6647,7 @@
         </w:rPr>
         <w:t>PNnJXl</w:t>
       </w:r>
+      <w:proofErr w:type="spellEnd"/>
       <w:r>
         <w:rPr>
           <w:rFonts w:ascii="Times New Roman" w:hAnsi="Times New Roman" w:cs="Times New Roman"/>
@@ -6663,13 +6955,23 @@
         </w:rPr>
         <w:t xml:space="preserve">Есть </w:t>
       </w:r>
-      <w:r>
-        <w:rPr>
-          <w:rFonts w:ascii="Times New Roman" w:hAnsi="Times New Roman" w:cs="Times New Roman"/>
-          <w:sz w:val="28"/>
-          <w:szCs w:val="28"/>
-        </w:rPr>
-        <w:t>мультимножество где есть только одно число</w:t>
+      <w:proofErr w:type="gramStart"/>
+      <w:r>
+        <w:rPr>
+          <w:rFonts w:ascii="Times New Roman" w:hAnsi="Times New Roman" w:cs="Times New Roman"/>
+          <w:sz w:val="28"/>
+          <w:szCs w:val="28"/>
+        </w:rPr>
+        <w:t>мультимножество</w:t>
+      </w:r>
+      <w:proofErr w:type="gramEnd"/>
+      <w:r>
+        <w:rPr>
+          <w:rFonts w:ascii="Times New Roman" w:hAnsi="Times New Roman" w:cs="Times New Roman"/>
+          <w:sz w:val="28"/>
+          <w:szCs w:val="28"/>
+        </w:rPr>
+        <w:t xml:space="preserve"> где есть только одно число</w:t>
       </w:r>
       <w:r>
         <w:rPr>
@@ -7583,6 +7885,7 @@
         </w:rPr>
         <w:t>://</w:t>
       </w:r>
+      <w:proofErr w:type="spellStart"/>
       <w:r>
         <w:rPr>
           <w:rFonts w:ascii="Times New Roman" w:hAnsi="Times New Roman" w:cs="Times New Roman"/>
@@ -7592,6 +7895,7 @@
         </w:rPr>
         <w:t>codeforces</w:t>
       </w:r>
+      <w:proofErr w:type="spellEnd"/>
       <w:r>
         <w:rPr>
           <w:rFonts w:ascii="Times New Roman" w:hAnsi="Times New Roman" w:cs="Times New Roman"/>
@@ -7634,6 +7938,7 @@
         </w:rPr>
         <w:t>/</w:t>
       </w:r>
+      <w:proofErr w:type="spellStart"/>
       <w:r>
         <w:rPr>
           <w:rFonts w:ascii="Times New Roman" w:hAnsi="Times New Roman" w:cs="Times New Roman"/>
@@ -7643,6 +7948,7 @@
         </w:rPr>
         <w:t>PNnJXl</w:t>
       </w:r>
+      <w:proofErr w:type="spellEnd"/>
       <w:r>
         <w:rPr>
           <w:rFonts w:ascii="Times New Roman" w:hAnsi="Times New Roman" w:cs="Times New Roman"/>
@@ -8875,6 +9181,7 @@
         </w:rPr>
         <w:t>://</w:t>
       </w:r>
+      <w:proofErr w:type="spellStart"/>
       <w:r>
         <w:rPr>
           <w:rFonts w:ascii="Times New Roman" w:hAnsi="Times New Roman" w:cs="Times New Roman"/>
@@ -8884,6 +9191,7 @@
         </w:rPr>
         <w:t>codeforces</w:t>
       </w:r>
+      <w:proofErr w:type="spellEnd"/>
       <w:r>
         <w:rPr>
           <w:rFonts w:ascii="Times New Roman" w:hAnsi="Times New Roman" w:cs="Times New Roman"/>
@@ -8926,6 +9234,7 @@
         </w:rPr>
         <w:t>/</w:t>
       </w:r>
+      <w:proofErr w:type="spellStart"/>
       <w:r>
         <w:rPr>
           <w:rFonts w:ascii="Times New Roman" w:hAnsi="Times New Roman" w:cs="Times New Roman"/>
@@ -8935,6 +9244,7 @@
         </w:rPr>
         <w:t>PNnJXl</w:t>
       </w:r>
+      <w:proofErr w:type="spellEnd"/>
       <w:r>
         <w:rPr>
           <w:rFonts w:ascii="Times New Roman" w:hAnsi="Times New Roman" w:cs="Times New Roman"/>
@@ -9184,7 +9494,27 @@
           <w:sz w:val="28"/>
           <w:szCs w:val="28"/>
         </w:rPr>
-        <w:t xml:space="preserve">. Скибидус и </w:t>
+        <w:t xml:space="preserve">. </w:t>
+      </w:r>
+      <w:proofErr w:type="spellStart"/>
+      <w:r>
+        <w:rPr>
+          <w:rFonts w:ascii="Times New Roman" w:hAnsi="Times New Roman" w:cs="Times New Roman"/>
+          <w:b/>
+          <w:sz w:val="28"/>
+          <w:szCs w:val="28"/>
+        </w:rPr>
+        <w:t>Скибидус</w:t>
+      </w:r>
+      <w:proofErr w:type="spellEnd"/>
+      <w:r>
+        <w:rPr>
+          <w:rFonts w:ascii="Times New Roman" w:hAnsi="Times New Roman" w:cs="Times New Roman"/>
+          <w:b/>
+          <w:sz w:val="28"/>
+          <w:szCs w:val="28"/>
+        </w:rPr>
+        <w:t xml:space="preserve"> и </w:t>
       </w:r>
       <w:r>
         <w:rPr>
@@ -9335,7 +9665,16 @@
           <w:sz w:val="28"/>
           <w:szCs w:val="28"/>
         </w:rPr>
-        <w:t xml:space="preserve"> a можно не более одного раза сделать следующее:</w:t>
+        <w:t xml:space="preserve"> a можно не более одного раза сделать следующее</w:t>
+      </w:r>
+      <w:proofErr w:type="gramStart"/>
+      <w:r>
+        <w:rPr>
+          <w:rFonts w:ascii="Times New Roman" w:hAnsi="Times New Roman" w:cs="Times New Roman"/>
+          <w:sz w:val="28"/>
+          <w:szCs w:val="28"/>
+        </w:rPr>
+        <w:t>:</w:t>
       </w:r>
       <w:r>
         <w:rPr>
@@ -9351,7 +9690,16 @@
           <w:sz w:val="28"/>
           <w:szCs w:val="28"/>
         </w:rPr>
-        <w:t>Заменить его на (единственное число из b) - (текущее значение).</w:t>
+        <w:t>Заменить</w:t>
+      </w:r>
+      <w:proofErr w:type="gramEnd"/>
+      <w:r>
+        <w:rPr>
+          <w:rFonts w:ascii="Times New Roman" w:hAnsi="Times New Roman" w:cs="Times New Roman"/>
+          <w:sz w:val="28"/>
+          <w:szCs w:val="28"/>
+        </w:rPr>
+        <w:t xml:space="preserve"> его на (единственное число из b) - (текущее значение).</w:t>
       </w:r>
     </w:p>
     <w:p>
@@ -10179,11 +10527,1364 @@
       <w:pPr>
         <w:spacing w:after="160" w:line="259" w:lineRule="auto"/>
         <w:rPr>
-          <w:rFonts w:ascii="Times New Roman" w:eastAsiaTheme="majorEastAsia" w:hAnsi="Times New Roman" w:cs="Times New Roman"/>
+          <w:rFonts w:ascii="Times New Roman" w:hAnsi="Times New Roman" w:cs="Times New Roman"/>
           <w:b/>
           <w:bCs/>
-          <w:sz w:val="32"/>
-          <w:szCs w:val="32"/>
+        </w:rPr>
+      </w:pPr>
+    </w:p>
+    <w:p>
+      <w:pPr>
+        <w:spacing w:after="160" w:line="259" w:lineRule="auto"/>
+        <w:rPr>
+          <w:rFonts w:ascii="Times New Roman" w:hAnsi="Times New Roman" w:cs="Times New Roman"/>
+          <w:b/>
+          <w:bCs/>
+        </w:rPr>
+      </w:pPr>
+      <w:r>
+        <w:rPr>
+          <w:rFonts w:ascii="Times New Roman" w:hAnsi="Times New Roman" w:cs="Times New Roman"/>
+          <w:b/>
+          <w:bCs/>
+        </w:rPr>
+        <w:br w:type="page"/>
+      </w:r>
+    </w:p>
+    <w:p>
+      <w:pPr>
+        <w:jc w:val="both"/>
+        <w:rPr>
+          <w:rFonts w:ascii="Times New Roman" w:hAnsi="Times New Roman" w:cs="Times New Roman"/>
+          <w:b/>
+          <w:sz w:val="28"/>
+          <w:szCs w:val="28"/>
+        </w:rPr>
+      </w:pPr>
+      <w:r>
+        <w:rPr>
+          <w:rFonts w:ascii="Times New Roman" w:hAnsi="Times New Roman" w:cs="Times New Roman"/>
+          <w:b/>
+          <w:sz w:val="28"/>
+          <w:szCs w:val="28"/>
+        </w:rPr>
+        <w:lastRenderedPageBreak/>
+        <w:t>4.</w:t>
+      </w:r>
+      <w:r>
+        <w:rPr>
+          <w:rFonts w:ascii="Times New Roman" w:hAnsi="Times New Roman" w:cs="Times New Roman"/>
+          <w:b/>
+          <w:sz w:val="28"/>
+          <w:szCs w:val="28"/>
+          <w:lang w:val="en-US"/>
+        </w:rPr>
+        <w:t>5</w:t>
+      </w:r>
+      <w:r>
+        <w:rPr>
+          <w:rFonts w:ascii="Times New Roman" w:hAnsi="Times New Roman" w:cs="Times New Roman"/>
+          <w:b/>
+          <w:sz w:val="28"/>
+          <w:szCs w:val="28"/>
+        </w:rPr>
+        <w:t xml:space="preserve"> Выполнение задания </w:t>
+      </w:r>
+      <w:r>
+        <w:rPr>
+          <w:rFonts w:ascii="Times New Roman" w:hAnsi="Times New Roman" w:cs="Times New Roman"/>
+          <w:b/>
+          <w:sz w:val="28"/>
+          <w:szCs w:val="28"/>
+          <w:lang w:val="en-US"/>
+        </w:rPr>
+        <w:t>25</w:t>
+      </w:r>
+      <w:r>
+        <w:rPr>
+          <w:rFonts w:ascii="Times New Roman" w:hAnsi="Times New Roman" w:cs="Times New Roman"/>
+          <w:b/>
+          <w:sz w:val="28"/>
+          <w:szCs w:val="28"/>
+        </w:rPr>
+        <w:t>.</w:t>
+      </w:r>
+      <w:r>
+        <w:rPr>
+          <w:rFonts w:ascii="Times New Roman" w:hAnsi="Times New Roman" w:cs="Times New Roman"/>
+          <w:b/>
+          <w:sz w:val="28"/>
+          <w:szCs w:val="28"/>
+          <w:lang w:val="en-US"/>
+        </w:rPr>
+        <w:t>10</w:t>
+      </w:r>
+      <w:r>
+        <w:rPr>
+          <w:rFonts w:ascii="Times New Roman" w:hAnsi="Times New Roman" w:cs="Times New Roman"/>
+          <w:b/>
+          <w:sz w:val="28"/>
+          <w:szCs w:val="28"/>
+        </w:rPr>
+        <w:t>.202</w:t>
+      </w:r>
+      <w:r>
+        <w:rPr>
+          <w:rFonts w:ascii="Times New Roman" w:hAnsi="Times New Roman" w:cs="Times New Roman"/>
+          <w:b/>
+          <w:sz w:val="28"/>
+          <w:szCs w:val="28"/>
+        </w:rPr>
+        <w:t>5</w:t>
+      </w:r>
+    </w:p>
+    <w:p>
+      <w:pPr>
+        <w:ind w:firstLine="709"/>
+      </w:pPr>
+      <w:r>
+        <w:rPr>
+          <w:rFonts w:ascii="Times New Roman" w:hAnsi="Times New Roman" w:cs="Times New Roman"/>
+          <w:sz w:val="28"/>
+          <w:szCs w:val="28"/>
+        </w:rPr>
+        <w:t xml:space="preserve">Ссылка на задание: </w:t>
+      </w:r>
+    </w:p>
+    <w:p>
+      <w:pPr>
+        <w:ind w:firstLine="709"/>
+        <w:jc w:val="both"/>
+        <w:rPr>
+          <w:rFonts w:ascii="Times New Roman" w:hAnsi="Times New Roman" w:cs="Times New Roman"/>
+          <w:sz w:val="28"/>
+          <w:szCs w:val="28"/>
+          <w:lang w:val="en-US"/>
+        </w:rPr>
+      </w:pPr>
+      <w:r>
+        <w:rPr>
+          <w:rFonts w:ascii="Times New Roman" w:hAnsi="Times New Roman" w:cs="Times New Roman"/>
+          <w:sz w:val="28"/>
+          <w:szCs w:val="28"/>
+          <w:lang w:val="en-US"/>
+        </w:rPr>
+        <w:t>https</w:t>
+      </w:r>
+      <w:r>
+        <w:rPr>
+          <w:rFonts w:ascii="Times New Roman" w:hAnsi="Times New Roman" w:cs="Times New Roman"/>
+          <w:sz w:val="28"/>
+          <w:szCs w:val="28"/>
+        </w:rPr>
+        <w:t>://</w:t>
+      </w:r>
+      <w:proofErr w:type="spellStart"/>
+      <w:r>
+        <w:rPr>
+          <w:rFonts w:ascii="Times New Roman" w:hAnsi="Times New Roman" w:cs="Times New Roman"/>
+          <w:sz w:val="28"/>
+          <w:szCs w:val="28"/>
+          <w:lang w:val="en-US"/>
+        </w:rPr>
+        <w:t>codeforces</w:t>
+      </w:r>
+      <w:proofErr w:type="spellEnd"/>
+      <w:r>
+        <w:rPr>
+          <w:rFonts w:ascii="Times New Roman" w:hAnsi="Times New Roman" w:cs="Times New Roman"/>
+          <w:sz w:val="28"/>
+          <w:szCs w:val="28"/>
+        </w:rPr>
+        <w:t>.</w:t>
+      </w:r>
+      <w:r>
+        <w:rPr>
+          <w:rFonts w:ascii="Times New Roman" w:hAnsi="Times New Roman" w:cs="Times New Roman"/>
+          <w:sz w:val="28"/>
+          <w:szCs w:val="28"/>
+          <w:lang w:val="en-US"/>
+        </w:rPr>
+        <w:t>com</w:t>
+      </w:r>
+      <w:r>
+        <w:rPr>
+          <w:rFonts w:ascii="Times New Roman" w:hAnsi="Times New Roman" w:cs="Times New Roman"/>
+          <w:sz w:val="28"/>
+          <w:szCs w:val="28"/>
+        </w:rPr>
+        <w:t>/</w:t>
+      </w:r>
+      <w:r>
+        <w:rPr>
+          <w:rFonts w:ascii="Times New Roman" w:hAnsi="Times New Roman" w:cs="Times New Roman"/>
+          <w:sz w:val="28"/>
+          <w:szCs w:val="28"/>
+          <w:lang w:val="en-US"/>
+        </w:rPr>
+        <w:t>group</w:t>
+      </w:r>
+      <w:r>
+        <w:rPr>
+          <w:rFonts w:ascii="Times New Roman" w:hAnsi="Times New Roman" w:cs="Times New Roman"/>
+          <w:sz w:val="28"/>
+          <w:szCs w:val="28"/>
+        </w:rPr>
+        <w:t>/</w:t>
+      </w:r>
+      <w:proofErr w:type="spellStart"/>
+      <w:r>
+        <w:rPr>
+          <w:rFonts w:ascii="Times New Roman" w:hAnsi="Times New Roman" w:cs="Times New Roman"/>
+          <w:sz w:val="28"/>
+          <w:szCs w:val="28"/>
+          <w:lang w:val="en-US"/>
+        </w:rPr>
+        <w:t>PNnJXl</w:t>
+      </w:r>
+      <w:proofErr w:type="spellEnd"/>
+      <w:r>
+        <w:rPr>
+          <w:rFonts w:ascii="Times New Roman" w:hAnsi="Times New Roman" w:cs="Times New Roman"/>
+          <w:sz w:val="28"/>
+          <w:szCs w:val="28"/>
+        </w:rPr>
+        <w:t>1</w:t>
+      </w:r>
+      <w:r>
+        <w:rPr>
+          <w:rFonts w:ascii="Times New Roman" w:hAnsi="Times New Roman" w:cs="Times New Roman"/>
+          <w:sz w:val="28"/>
+          <w:szCs w:val="28"/>
+          <w:lang w:val="en-US"/>
+        </w:rPr>
+        <w:t>VKU</w:t>
+      </w:r>
+      <w:r>
+        <w:rPr>
+          <w:rFonts w:ascii="Times New Roman" w:hAnsi="Times New Roman" w:cs="Times New Roman"/>
+          <w:sz w:val="28"/>
+          <w:szCs w:val="28"/>
+        </w:rPr>
+        <w:t>/</w:t>
+      </w:r>
+      <w:r>
+        <w:rPr>
+          <w:rFonts w:ascii="Times New Roman" w:hAnsi="Times New Roman" w:cs="Times New Roman"/>
+          <w:sz w:val="28"/>
+          <w:szCs w:val="28"/>
+          <w:lang w:val="en-US"/>
+        </w:rPr>
+        <w:t>contest</w:t>
+      </w:r>
+      <w:r>
+        <w:rPr>
+          <w:rFonts w:ascii="Times New Roman" w:hAnsi="Times New Roman" w:cs="Times New Roman"/>
+          <w:sz w:val="28"/>
+          <w:szCs w:val="28"/>
+        </w:rPr>
+        <w:t>/649430/</w:t>
+      </w:r>
+      <w:r>
+        <w:rPr>
+          <w:rFonts w:ascii="Times New Roman" w:hAnsi="Times New Roman" w:cs="Times New Roman"/>
+          <w:sz w:val="28"/>
+          <w:szCs w:val="28"/>
+          <w:lang w:val="en-US"/>
+        </w:rPr>
+        <w:t>problem</w:t>
+      </w:r>
+      <w:r>
+        <w:rPr>
+          <w:rFonts w:ascii="Times New Roman" w:hAnsi="Times New Roman" w:cs="Times New Roman"/>
+          <w:sz w:val="28"/>
+          <w:szCs w:val="28"/>
+        </w:rPr>
+        <w:t>/</w:t>
+      </w:r>
+      <w:r>
+        <w:rPr>
+          <w:rFonts w:ascii="Times New Roman" w:hAnsi="Times New Roman" w:cs="Times New Roman"/>
+          <w:sz w:val="28"/>
+          <w:szCs w:val="28"/>
+          <w:lang w:val="en-US"/>
+        </w:rPr>
+        <w:t>D</w:t>
+      </w:r>
+      <w:r>
+        <w:rPr>
+          <w:rFonts w:ascii="Times New Roman" w:hAnsi="Times New Roman" w:cs="Times New Roman"/>
+          <w:sz w:val="28"/>
+          <w:szCs w:val="28"/>
+        </w:rPr>
+        <w:t xml:space="preserve"> </w:t>
+      </w:r>
+    </w:p>
+    <w:p>
+      <w:pPr>
+        <w:ind w:firstLine="709"/>
+        <w:jc w:val="both"/>
+        <w:rPr>
+          <w:rFonts w:ascii="Times New Roman" w:hAnsi="Times New Roman" w:cs="Times New Roman"/>
+          <w:sz w:val="28"/>
+          <w:szCs w:val="28"/>
+        </w:rPr>
+      </w:pPr>
+      <w:r>
+        <w:rPr>
+          <w:rFonts w:ascii="Times New Roman" w:hAnsi="Times New Roman" w:cs="Times New Roman"/>
+          <w:sz w:val="28"/>
+          <w:szCs w:val="28"/>
+        </w:rPr>
+        <w:t xml:space="preserve">Результат решения задач набора представлен на рисунке </w:t>
+      </w:r>
+      <w:r>
+        <w:rPr>
+          <w:rFonts w:ascii="Times New Roman" w:hAnsi="Times New Roman" w:cs="Times New Roman"/>
+          <w:sz w:val="28"/>
+          <w:szCs w:val="28"/>
+        </w:rPr>
+        <w:t>10</w:t>
+      </w:r>
+      <w:r>
+        <w:rPr>
+          <w:rFonts w:ascii="Times New Roman" w:hAnsi="Times New Roman" w:cs="Times New Roman"/>
+          <w:sz w:val="28"/>
+          <w:szCs w:val="28"/>
+        </w:rPr>
+        <w:t>.</w:t>
+      </w:r>
+    </w:p>
+    <w:p>
+      <w:pPr>
+        <w:jc w:val="center"/>
+        <w:rPr>
+          <w:rFonts w:ascii="Times New Roman" w:hAnsi="Times New Roman" w:cs="Times New Roman"/>
+          <w:b/>
+          <w:highlight w:val="yellow"/>
+        </w:rPr>
+      </w:pPr>
+      <w:r>
+        <w:rPr>
+          <w:rFonts w:ascii="Times New Roman" w:hAnsi="Times New Roman" w:cs="Times New Roman"/>
+          <w:b/>
+          <w:noProof/>
+          <w:highlight w:val="yellow"/>
+          <w:lang w:eastAsia="ru-RU"/>
+        </w:rPr>
+        <w:drawing>
+          <wp:inline distT="0" distB="0" distL="0" distR="0" wp14:anchorId="1E7CC1CE" wp14:editId="6E9ADFBB">
+            <wp:extent cx="6029325" cy="3398808"/>
+            <wp:effectExtent l="0" t="0" r="0" b="0"/>
+            <wp:docPr id="53782345" name="Рисунок 4"/>
+            <wp:cNvGraphicFramePr>
+              <a:graphicFrameLocks xmlns:a="http://schemas.openxmlformats.org/drawingml/2006/main" noChangeAspect="1"/>
+            </wp:cNvGraphicFramePr>
+            <a:graphic xmlns:a="http://schemas.openxmlformats.org/drawingml/2006/main">
+              <a:graphicData uri="http://schemas.openxmlformats.org/drawingml/2006/picture">
+                <pic:pic xmlns:pic="http://schemas.openxmlformats.org/drawingml/2006/picture">
+                  <pic:nvPicPr>
+                    <pic:cNvPr id="53782345" name="Рисунок 4"/>
+                    <pic:cNvPicPr>
+                      <a:picLocks noChangeAspect="1"/>
+                    </pic:cNvPicPr>
+                  </pic:nvPicPr>
+                  <pic:blipFill>
+                    <a:blip r:embed="rId25">
+                      <a:extLst>
+                        <a:ext uri="{28A0092B-C50C-407E-A947-70E740481C1C}">
+                          <a14:useLocalDpi xmlns:a14="http://schemas.microsoft.com/office/drawing/2010/main" val="0"/>
+                        </a:ext>
+                      </a:extLst>
+                    </a:blip>
+                    <a:srcRect t="1194" b="1194"/>
+                    <a:stretch>
+                      <a:fillRect/>
+                    </a:stretch>
+                  </pic:blipFill>
+                  <pic:spPr bwMode="auto">
+                    <a:xfrm>
+                      <a:off x="0" y="0"/>
+                      <a:ext cx="6029325" cy="3398808"/>
+                    </a:xfrm>
+                    <a:prstGeom prst="rect">
+                      <a:avLst/>
+                    </a:prstGeom>
+                    <a:noFill/>
+                    <a:ln>
+                      <a:noFill/>
+                    </a:ln>
+                  </pic:spPr>
+                </pic:pic>
+              </a:graphicData>
+            </a:graphic>
+          </wp:inline>
+        </w:drawing>
+      </w:r>
+    </w:p>
+    <w:p>
+      <w:pPr>
+        <w:jc w:val="center"/>
+        <w:rPr>
+          <w:rFonts w:ascii="Times New Roman" w:hAnsi="Times New Roman" w:cs="Times New Roman"/>
+          <w:sz w:val="28"/>
+          <w:szCs w:val="28"/>
+        </w:rPr>
+      </w:pPr>
+      <w:r>
+        <w:rPr>
+          <w:rFonts w:ascii="Times New Roman" w:hAnsi="Times New Roman" w:cs="Times New Roman"/>
+          <w:sz w:val="28"/>
+          <w:szCs w:val="28"/>
+        </w:rPr>
+        <w:t xml:space="preserve">Рисунок </w:t>
+      </w:r>
+      <w:r>
+        <w:rPr>
+          <w:rFonts w:ascii="Times New Roman" w:hAnsi="Times New Roman" w:cs="Times New Roman"/>
+          <w:sz w:val="28"/>
+          <w:szCs w:val="28"/>
+        </w:rPr>
+        <w:t>10</w:t>
+      </w:r>
+      <w:r>
+        <w:rPr>
+          <w:rFonts w:ascii="Times New Roman" w:hAnsi="Times New Roman" w:cs="Times New Roman"/>
+          <w:sz w:val="28"/>
+          <w:szCs w:val="28"/>
+        </w:rPr>
+        <w:t xml:space="preserve"> – Результат от </w:t>
+      </w:r>
+      <w:r>
+        <w:rPr>
+          <w:rFonts w:ascii="Times New Roman" w:hAnsi="Times New Roman" w:cs="Times New Roman"/>
+          <w:sz w:val="28"/>
+          <w:szCs w:val="28"/>
+        </w:rPr>
+        <w:t>25</w:t>
+      </w:r>
+      <w:r>
+        <w:rPr>
+          <w:rFonts w:ascii="Times New Roman" w:hAnsi="Times New Roman" w:cs="Times New Roman"/>
+          <w:sz w:val="28"/>
+          <w:szCs w:val="28"/>
+        </w:rPr>
+        <w:t>.</w:t>
+      </w:r>
+      <w:r>
+        <w:rPr>
+          <w:rFonts w:ascii="Times New Roman" w:hAnsi="Times New Roman" w:cs="Times New Roman"/>
+          <w:sz w:val="28"/>
+          <w:szCs w:val="28"/>
+        </w:rPr>
+        <w:t>10</w:t>
+      </w:r>
+      <w:r>
+        <w:rPr>
+          <w:rFonts w:ascii="Times New Roman" w:hAnsi="Times New Roman" w:cs="Times New Roman"/>
+          <w:sz w:val="28"/>
+          <w:szCs w:val="28"/>
+        </w:rPr>
+        <w:t>.2025 г.</w:t>
+      </w:r>
+    </w:p>
+    <w:p>
+      <w:pPr>
+        <w:jc w:val="both"/>
+        <w:rPr>
+          <w:rFonts w:ascii="Times New Roman" w:hAnsi="Times New Roman" w:cs="Times New Roman"/>
+          <w:b/>
+          <w:sz w:val="28"/>
+          <w:szCs w:val="28"/>
+        </w:rPr>
+      </w:pPr>
+      <w:r>
+        <w:rPr>
+          <w:rFonts w:ascii="Times New Roman" w:hAnsi="Times New Roman" w:cs="Times New Roman"/>
+          <w:b/>
+          <w:sz w:val="28"/>
+          <w:szCs w:val="28"/>
+        </w:rPr>
+        <w:t xml:space="preserve">Задача </w:t>
+      </w:r>
+      <w:r>
+        <w:rPr>
+          <w:rFonts w:ascii="Times New Roman" w:hAnsi="Times New Roman" w:cs="Times New Roman"/>
+          <w:b/>
+          <w:sz w:val="28"/>
+          <w:szCs w:val="28"/>
+          <w:lang w:val="en-US"/>
+        </w:rPr>
+        <w:t>D</w:t>
+      </w:r>
+      <w:r>
+        <w:rPr>
+          <w:rFonts w:ascii="Times New Roman" w:hAnsi="Times New Roman" w:cs="Times New Roman"/>
+          <w:b/>
+          <w:sz w:val="28"/>
+          <w:szCs w:val="28"/>
+        </w:rPr>
+        <w:t xml:space="preserve">. </w:t>
+      </w:r>
+      <w:r>
+        <w:rPr>
+          <w:rFonts w:ascii="Times New Roman" w:hAnsi="Times New Roman" w:cs="Times New Roman"/>
+          <w:b/>
+          <w:sz w:val="28"/>
+          <w:szCs w:val="28"/>
+        </w:rPr>
+        <w:t>Грегор и игра в пешки</w:t>
+      </w:r>
+      <w:r>
+        <w:rPr>
+          <w:rFonts w:ascii="Times New Roman" w:hAnsi="Times New Roman" w:cs="Times New Roman"/>
+          <w:b/>
+          <w:sz w:val="28"/>
+          <w:szCs w:val="28"/>
+        </w:rPr>
+        <w:t>.</w:t>
+      </w:r>
+    </w:p>
+    <w:p>
+      <w:pPr>
+        <w:jc w:val="both"/>
+        <w:rPr>
+          <w:rFonts w:ascii="Times New Roman" w:hAnsi="Times New Roman" w:cs="Times New Roman"/>
+          <w:b/>
+          <w:sz w:val="28"/>
+          <w:szCs w:val="28"/>
+        </w:rPr>
+      </w:pPr>
+      <w:r>
+        <w:rPr>
+          <w:rFonts w:ascii="Times New Roman" w:hAnsi="Times New Roman" w:cs="Times New Roman"/>
+          <w:b/>
+          <w:sz w:val="28"/>
+          <w:szCs w:val="28"/>
+        </w:rPr>
+        <w:t>Постановка задачи.</w:t>
+      </w:r>
+    </w:p>
+    <w:p>
+      <w:pPr>
+        <w:spacing w:after="160" w:line="259" w:lineRule="auto"/>
+        <w:rPr>
+          <w:rFonts w:ascii="Times New Roman" w:hAnsi="Times New Roman" w:cs="Times New Roman"/>
+          <w:sz w:val="28"/>
+          <w:szCs w:val="28"/>
+        </w:rPr>
+      </w:pPr>
+      <w:r>
+        <w:rPr>
+          <w:rFonts w:ascii="Times New Roman" w:hAnsi="Times New Roman" w:cs="Times New Roman"/>
+          <w:sz w:val="28"/>
+          <w:szCs w:val="28"/>
+        </w:rPr>
+        <w:t>Нужно определить, сколько пешек можно довести до верхнего ряда, используя:</w:t>
+      </w:r>
+    </w:p>
+    <w:p>
+      <w:pPr>
+        <w:spacing w:after="160" w:line="259" w:lineRule="auto"/>
+        <w:rPr>
+          <w:rFonts w:ascii="Times New Roman" w:hAnsi="Times New Roman" w:cs="Times New Roman"/>
+          <w:sz w:val="28"/>
+          <w:szCs w:val="28"/>
+        </w:rPr>
+      </w:pPr>
+      <w:r>
+        <w:rPr>
+          <w:rFonts w:ascii="Times New Roman" w:hAnsi="Times New Roman" w:cs="Times New Roman"/>
+          <w:sz w:val="28"/>
+          <w:szCs w:val="28"/>
+        </w:rPr>
+        <w:t xml:space="preserve">1. </w:t>
+      </w:r>
+      <w:r>
+        <w:rPr>
+          <w:rFonts w:ascii="Times New Roman" w:hAnsi="Times New Roman" w:cs="Times New Roman"/>
+          <w:sz w:val="28"/>
+          <w:szCs w:val="28"/>
+        </w:rPr>
+        <w:t>прямое движение вверх (если клетка свободна)</w:t>
+      </w:r>
+    </w:p>
+    <w:p>
+      <w:pPr>
+        <w:spacing w:after="160" w:line="259" w:lineRule="auto"/>
+        <w:rPr>
+          <w:rFonts w:ascii="Times New Roman" w:hAnsi="Times New Roman" w:cs="Times New Roman"/>
+          <w:sz w:val="28"/>
+          <w:szCs w:val="28"/>
+        </w:rPr>
+      </w:pPr>
+      <w:r>
+        <w:rPr>
+          <w:rFonts w:ascii="Times New Roman" w:hAnsi="Times New Roman" w:cs="Times New Roman"/>
+          <w:sz w:val="28"/>
+          <w:szCs w:val="28"/>
+        </w:rPr>
+        <w:t xml:space="preserve">2. </w:t>
+      </w:r>
+      <w:r>
+        <w:rPr>
+          <w:rFonts w:ascii="Times New Roman" w:hAnsi="Times New Roman" w:cs="Times New Roman"/>
+          <w:sz w:val="28"/>
+          <w:szCs w:val="28"/>
+        </w:rPr>
+        <w:t>или "съедание" вражеской пешки по диагонали (если клетка занята врагом).</w:t>
+      </w:r>
+    </w:p>
+    <w:p>
+      <w:pPr>
+        <w:spacing w:after="160" w:line="259" w:lineRule="auto"/>
+        <w:rPr>
+          <w:rFonts w:ascii="Times New Roman" w:hAnsi="Times New Roman" w:cs="Times New Roman"/>
+          <w:sz w:val="28"/>
+          <w:szCs w:val="28"/>
+        </w:rPr>
+      </w:pPr>
+      <w:r>
+        <w:rPr>
+          <w:rFonts w:ascii="Times New Roman" w:hAnsi="Times New Roman" w:cs="Times New Roman"/>
+          <w:sz w:val="28"/>
+          <w:szCs w:val="28"/>
+        </w:rPr>
+        <w:br w:type="page"/>
+      </w:r>
+    </w:p>
+    <w:p>
+      <w:pPr>
+        <w:jc w:val="both"/>
+        <w:rPr>
+          <w:rFonts w:ascii="Times New Roman" w:hAnsi="Times New Roman" w:cs="Times New Roman"/>
+          <w:b/>
+          <w:sz w:val="28"/>
+          <w:szCs w:val="28"/>
+        </w:rPr>
+      </w:pPr>
+      <w:r>
+        <w:rPr>
+          <w:rFonts w:ascii="Times New Roman" w:hAnsi="Times New Roman" w:cs="Times New Roman"/>
+          <w:b/>
+          <w:sz w:val="28"/>
+          <w:szCs w:val="28"/>
+        </w:rPr>
+        <w:lastRenderedPageBreak/>
+        <w:t>Алгоритм решения</w:t>
+      </w:r>
+    </w:p>
+    <w:p>
+      <w:pPr>
+        <w:spacing w:after="0" w:line="240" w:lineRule="auto"/>
+        <w:jc w:val="center"/>
+        <w:rPr>
+          <w:rFonts w:ascii="Times New Roman" w:hAnsi="Times New Roman" w:cs="Times New Roman"/>
+          <w:sz w:val="28"/>
+          <w:szCs w:val="28"/>
+          <w:highlight w:val="yellow"/>
+          <w:lang w:val="en-US"/>
+        </w:rPr>
+      </w:pPr>
+      <w:r>
+        <w:rPr>
+          <w:noProof/>
+          <w:lang w:eastAsia="ru-RU"/>
+        </w:rPr>
+        <w:drawing>
+          <wp:inline distT="0" distB="0" distL="0" distR="0" wp14:anchorId="7B1AA0F5" wp14:editId="2F073484">
+            <wp:extent cx="6063745" cy="7598979"/>
+            <wp:effectExtent l="0" t="0" r="0" b="2540"/>
+            <wp:docPr id="97096519" name="Рисунок 2"/>
+            <wp:cNvGraphicFramePr>
+              <a:graphicFrameLocks xmlns:a="http://schemas.openxmlformats.org/drawingml/2006/main" noChangeAspect="1"/>
+            </wp:cNvGraphicFramePr>
+            <a:graphic xmlns:a="http://schemas.openxmlformats.org/drawingml/2006/main">
+              <a:graphicData uri="http://schemas.openxmlformats.org/drawingml/2006/picture">
+                <pic:pic xmlns:pic="http://schemas.openxmlformats.org/drawingml/2006/picture">
+                  <pic:nvPicPr>
+                    <pic:cNvPr id="97096519" name="Рисунок 2"/>
+                    <pic:cNvPicPr>
+                      <a:picLocks noChangeAspect="1"/>
+                    </pic:cNvPicPr>
+                  </pic:nvPicPr>
+                  <pic:blipFill>
+                    <a:blip r:embed="rId26">
+                      <a:extLst>
+                        <a:ext uri="{28A0092B-C50C-407E-A947-70E740481C1C}">
+                          <a14:useLocalDpi xmlns:a14="http://schemas.microsoft.com/office/drawing/2010/main" val="0"/>
+                        </a:ext>
+                      </a:extLst>
+                    </a:blip>
+                    <a:stretch>
+                      <a:fillRect/>
+                    </a:stretch>
+                  </pic:blipFill>
+                  <pic:spPr bwMode="auto">
+                    <a:xfrm>
+                      <a:off x="0" y="0"/>
+                      <a:ext cx="6085457" cy="7626188"/>
+                    </a:xfrm>
+                    <a:prstGeom prst="rect">
+                      <a:avLst/>
+                    </a:prstGeom>
+                  </pic:spPr>
+                </pic:pic>
+              </a:graphicData>
+            </a:graphic>
+          </wp:inline>
+        </w:drawing>
+      </w:r>
+    </w:p>
+    <w:p>
+      <w:pPr>
+        <w:jc w:val="center"/>
+        <w:rPr>
+          <w:rFonts w:ascii="Times New Roman" w:hAnsi="Times New Roman" w:cs="Times New Roman"/>
+          <w:sz w:val="28"/>
+          <w:szCs w:val="28"/>
+        </w:rPr>
+      </w:pPr>
+      <w:r>
+        <w:rPr>
+          <w:rFonts w:ascii="Times New Roman" w:hAnsi="Times New Roman" w:cs="Times New Roman"/>
+          <w:sz w:val="28"/>
+          <w:szCs w:val="28"/>
+        </w:rPr>
+        <w:t xml:space="preserve">Рисунок </w:t>
+      </w:r>
+      <w:r>
+        <w:rPr>
+          <w:rFonts w:ascii="Times New Roman" w:hAnsi="Times New Roman" w:cs="Times New Roman"/>
+          <w:sz w:val="28"/>
+          <w:szCs w:val="28"/>
+          <w:lang w:val="en-US"/>
+        </w:rPr>
+        <w:t>11</w:t>
+      </w:r>
+      <w:r>
+        <w:rPr>
+          <w:rFonts w:ascii="Times New Roman" w:hAnsi="Times New Roman" w:cs="Times New Roman"/>
+          <w:sz w:val="28"/>
+          <w:szCs w:val="28"/>
+        </w:rPr>
+        <w:t xml:space="preserve"> – Алгоритм решения задачи</w:t>
+      </w:r>
+    </w:p>
+    <w:p>
+      <w:pPr>
+        <w:spacing w:after="160" w:line="259" w:lineRule="auto"/>
+        <w:rPr>
+          <w:rFonts w:ascii="Times New Roman" w:hAnsi="Times New Roman" w:cs="Times New Roman"/>
+          <w:sz w:val="28"/>
+          <w:szCs w:val="28"/>
+        </w:rPr>
+      </w:pPr>
+      <w:r>
+        <w:rPr>
+          <w:rFonts w:ascii="Times New Roman" w:hAnsi="Times New Roman" w:cs="Times New Roman"/>
+          <w:sz w:val="28"/>
+          <w:szCs w:val="28"/>
+        </w:rPr>
+        <w:br w:type="page" w:clear="all"/>
+      </w:r>
+    </w:p>
+    <w:p>
+      <w:pPr>
+        <w:jc w:val="both"/>
+        <w:rPr>
+          <w:rFonts w:ascii="Times New Roman" w:hAnsi="Times New Roman" w:cs="Times New Roman"/>
+          <w:sz w:val="28"/>
+          <w:szCs w:val="28"/>
+        </w:rPr>
+      </w:pPr>
+      <w:r>
+        <w:rPr>
+          <w:rFonts w:ascii="Times New Roman" w:hAnsi="Times New Roman" w:cs="Times New Roman"/>
+          <w:b/>
+          <w:sz w:val="28"/>
+          <w:szCs w:val="28"/>
+        </w:rPr>
+        <w:lastRenderedPageBreak/>
+        <w:t xml:space="preserve">Тестирование </w:t>
+      </w:r>
+    </w:p>
+    <w:tbl>
+      <w:tblPr>
+        <w:tblW w:w="0" w:type="auto"/>
+        <w:tblBorders>
+          <w:top w:val="single" w:sz="4" w:space="0" w:color="auto"/>
+          <w:left w:val="single" w:sz="4" w:space="0" w:color="auto"/>
+          <w:bottom w:val="single" w:sz="4" w:space="0" w:color="auto"/>
+          <w:right w:val="single" w:sz="4" w:space="0" w:color="auto"/>
+          <w:insideH w:val="single" w:sz="4" w:space="0" w:color="auto"/>
+          <w:insideV w:val="single" w:sz="4" w:space="0" w:color="auto"/>
+        </w:tblBorders>
+        <w:tblLook w:val="04A0" w:firstRow="1" w:lastRow="0" w:firstColumn="1" w:lastColumn="0" w:noHBand="0" w:noVBand="1"/>
+      </w:tblPr>
+      <w:tblGrid>
+        <w:gridCol w:w="4361"/>
+        <w:gridCol w:w="5103"/>
+      </w:tblGrid>
+      <w:tr>
+        <w:trPr>
+          <w:trHeight w:val="454"/>
+        </w:trPr>
+        <w:tc>
+          <w:tcPr>
+            <w:tcW w:w="4361" w:type="dxa"/>
+            <w:vAlign w:val="center"/>
+          </w:tcPr>
+          <w:p>
+            <w:pPr>
+              <w:spacing w:after="0" w:line="240" w:lineRule="auto"/>
+              <w:jc w:val="center"/>
+              <w:rPr>
+                <w:rFonts w:ascii="Times New Roman" w:hAnsi="Times New Roman" w:cs="Times New Roman"/>
+                <w:sz w:val="28"/>
+                <w:szCs w:val="28"/>
+              </w:rPr>
+            </w:pPr>
+            <w:r>
+              <w:rPr>
+                <w:rFonts w:ascii="Times New Roman" w:hAnsi="Times New Roman" w:cs="Times New Roman"/>
+                <w:sz w:val="28"/>
+                <w:szCs w:val="28"/>
+              </w:rPr>
+              <w:t>Входные данные</w:t>
+            </w:r>
+          </w:p>
+        </w:tc>
+        <w:tc>
+          <w:tcPr>
+            <w:tcW w:w="5103" w:type="dxa"/>
+            <w:vAlign w:val="center"/>
+          </w:tcPr>
+          <w:p>
+            <w:pPr>
+              <w:spacing w:after="0" w:line="240" w:lineRule="auto"/>
+              <w:jc w:val="center"/>
+              <w:rPr>
+                <w:rFonts w:ascii="Times New Roman" w:hAnsi="Times New Roman" w:cs="Times New Roman"/>
+                <w:sz w:val="28"/>
+                <w:szCs w:val="28"/>
+              </w:rPr>
+            </w:pPr>
+            <w:r>
+              <w:rPr>
+                <w:rFonts w:ascii="Times New Roman" w:hAnsi="Times New Roman" w:cs="Times New Roman"/>
+                <w:sz w:val="28"/>
+                <w:szCs w:val="28"/>
+              </w:rPr>
+              <w:t>Выходные данные</w:t>
+            </w:r>
+          </w:p>
+        </w:tc>
+      </w:tr>
+      <w:tr>
+        <w:trPr>
+          <w:trHeight w:val="454"/>
+        </w:trPr>
+        <w:tc>
+          <w:tcPr>
+            <w:tcW w:w="4361" w:type="dxa"/>
+            <w:vAlign w:val="center"/>
+          </w:tcPr>
+          <w:p>
+            <w:pPr>
+              <w:spacing w:after="0" w:line="240" w:lineRule="auto"/>
+              <w:rPr>
+                <w:rFonts w:ascii="Times New Roman" w:hAnsi="Times New Roman" w:cs="Times New Roman"/>
+                <w:sz w:val="28"/>
+                <w:szCs w:val="28"/>
+              </w:rPr>
+            </w:pPr>
+            <w:r>
+              <w:rPr>
+                <w:rFonts w:ascii="Times New Roman" w:hAnsi="Times New Roman" w:cs="Times New Roman"/>
+                <w:sz w:val="28"/>
+                <w:szCs w:val="28"/>
+              </w:rPr>
+              <w:t>3</w:t>
+            </w:r>
+          </w:p>
+          <w:p>
+            <w:pPr>
+              <w:spacing w:after="0" w:line="240" w:lineRule="auto"/>
+              <w:rPr>
+                <w:rFonts w:ascii="Times New Roman" w:hAnsi="Times New Roman" w:cs="Times New Roman"/>
+                <w:sz w:val="28"/>
+                <w:szCs w:val="28"/>
+              </w:rPr>
+            </w:pPr>
+            <w:r>
+              <w:rPr>
+                <w:rFonts w:ascii="Times New Roman" w:hAnsi="Times New Roman" w:cs="Times New Roman"/>
+                <w:sz w:val="28"/>
+                <w:szCs w:val="28"/>
+              </w:rPr>
+              <w:t>000</w:t>
+            </w:r>
+          </w:p>
+          <w:p>
+            <w:pPr>
+              <w:spacing w:after="0" w:line="240" w:lineRule="auto"/>
+              <w:rPr>
+                <w:rFonts w:ascii="Times New Roman" w:hAnsi="Times New Roman" w:cs="Times New Roman"/>
+                <w:sz w:val="28"/>
+                <w:szCs w:val="28"/>
+              </w:rPr>
+            </w:pPr>
+            <w:r>
+              <w:rPr>
+                <w:rFonts w:ascii="Times New Roman" w:hAnsi="Times New Roman" w:cs="Times New Roman"/>
+                <w:sz w:val="28"/>
+                <w:szCs w:val="28"/>
+              </w:rPr>
+              <w:t>111</w:t>
+            </w:r>
+          </w:p>
+        </w:tc>
+        <w:tc>
+          <w:tcPr>
+            <w:tcW w:w="5103" w:type="dxa"/>
+            <w:vAlign w:val="center"/>
+          </w:tcPr>
+          <w:p>
+            <w:pPr>
+              <w:spacing w:after="0" w:line="240" w:lineRule="auto"/>
+              <w:rPr>
+                <w:rFonts w:ascii="Times New Roman" w:hAnsi="Times New Roman" w:cs="Times New Roman"/>
+                <w:sz w:val="28"/>
+                <w:szCs w:val="28"/>
+                <w:lang w:val="en-US"/>
+              </w:rPr>
+            </w:pPr>
+            <w:r>
+              <w:rPr>
+                <w:rFonts w:ascii="Times New Roman" w:hAnsi="Times New Roman" w:cs="Times New Roman"/>
+                <w:sz w:val="28"/>
+                <w:szCs w:val="28"/>
+                <w:lang w:val="en-US"/>
+              </w:rPr>
+              <w:t>3</w:t>
+            </w:r>
+          </w:p>
+        </w:tc>
+      </w:tr>
+      <w:tr>
+        <w:trPr>
+          <w:trHeight w:val="454"/>
+        </w:trPr>
+        <w:tc>
+          <w:tcPr>
+            <w:tcW w:w="4361" w:type="dxa"/>
+            <w:vAlign w:val="center"/>
+          </w:tcPr>
+          <w:p>
+            <w:pPr>
+              <w:spacing w:after="0" w:line="240" w:lineRule="auto"/>
+              <w:rPr>
+                <w:rFonts w:ascii="Times New Roman" w:hAnsi="Times New Roman" w:cs="Times New Roman"/>
+                <w:sz w:val="28"/>
+                <w:szCs w:val="28"/>
+              </w:rPr>
+            </w:pPr>
+            <w:r>
+              <w:rPr>
+                <w:rFonts w:ascii="Times New Roman" w:hAnsi="Times New Roman" w:cs="Times New Roman"/>
+                <w:sz w:val="28"/>
+                <w:szCs w:val="28"/>
+              </w:rPr>
+              <w:t>4</w:t>
+            </w:r>
+          </w:p>
+          <w:p>
+            <w:pPr>
+              <w:spacing w:after="0" w:line="240" w:lineRule="auto"/>
+              <w:rPr>
+                <w:rFonts w:ascii="Times New Roman" w:hAnsi="Times New Roman" w:cs="Times New Roman"/>
+                <w:sz w:val="28"/>
+                <w:szCs w:val="28"/>
+              </w:rPr>
+            </w:pPr>
+            <w:r>
+              <w:rPr>
+                <w:rFonts w:ascii="Times New Roman" w:hAnsi="Times New Roman" w:cs="Times New Roman"/>
+                <w:sz w:val="28"/>
+                <w:szCs w:val="28"/>
+              </w:rPr>
+              <w:t>1111</w:t>
+            </w:r>
+          </w:p>
+          <w:p>
+            <w:pPr>
+              <w:spacing w:after="0" w:line="240" w:lineRule="auto"/>
+              <w:rPr>
+                <w:rFonts w:ascii="Times New Roman" w:hAnsi="Times New Roman" w:cs="Times New Roman"/>
+                <w:sz w:val="28"/>
+                <w:szCs w:val="28"/>
+              </w:rPr>
+            </w:pPr>
+            <w:r>
+              <w:rPr>
+                <w:rFonts w:ascii="Times New Roman" w:hAnsi="Times New Roman" w:cs="Times New Roman"/>
+                <w:sz w:val="28"/>
+                <w:szCs w:val="28"/>
+              </w:rPr>
+              <w:t>1111</w:t>
+            </w:r>
+          </w:p>
+        </w:tc>
+        <w:tc>
+          <w:tcPr>
+            <w:tcW w:w="5103" w:type="dxa"/>
+            <w:vAlign w:val="center"/>
+          </w:tcPr>
+          <w:p>
+            <w:pPr>
+              <w:spacing w:after="0" w:line="240" w:lineRule="auto"/>
+              <w:rPr>
+                <w:rFonts w:ascii="Times New Roman" w:hAnsi="Times New Roman" w:cs="Times New Roman"/>
+                <w:sz w:val="28"/>
+                <w:szCs w:val="28"/>
+                <w:lang w:val="en-US"/>
+              </w:rPr>
+            </w:pPr>
+            <w:r>
+              <w:rPr>
+                <w:rFonts w:ascii="Times New Roman" w:hAnsi="Times New Roman" w:cs="Times New Roman"/>
+                <w:sz w:val="28"/>
+                <w:szCs w:val="28"/>
+                <w:lang w:val="en-US"/>
+              </w:rPr>
+              <w:t>4</w:t>
+            </w:r>
+          </w:p>
+        </w:tc>
+      </w:tr>
+      <w:tr>
+        <w:trPr>
+          <w:trHeight w:val="454"/>
+        </w:trPr>
+        <w:tc>
+          <w:tcPr>
+            <w:tcW w:w="4361" w:type="dxa"/>
+            <w:vAlign w:val="center"/>
+          </w:tcPr>
+          <w:p>
+            <w:pPr>
+              <w:spacing w:after="0" w:line="240" w:lineRule="auto"/>
+              <w:rPr>
+                <w:rFonts w:ascii="Times New Roman" w:hAnsi="Times New Roman" w:cs="Times New Roman"/>
+                <w:sz w:val="28"/>
+                <w:szCs w:val="28"/>
+              </w:rPr>
+            </w:pPr>
+            <w:r>
+              <w:rPr>
+                <w:rFonts w:ascii="Times New Roman" w:hAnsi="Times New Roman" w:cs="Times New Roman"/>
+                <w:sz w:val="28"/>
+                <w:szCs w:val="28"/>
+              </w:rPr>
+              <w:t>3</w:t>
+            </w:r>
+          </w:p>
+          <w:p>
+            <w:pPr>
+              <w:spacing w:after="0" w:line="240" w:lineRule="auto"/>
+              <w:rPr>
+                <w:rFonts w:ascii="Times New Roman" w:hAnsi="Times New Roman" w:cs="Times New Roman"/>
+                <w:sz w:val="28"/>
+                <w:szCs w:val="28"/>
+              </w:rPr>
+            </w:pPr>
+            <w:r>
+              <w:rPr>
+                <w:rFonts w:ascii="Times New Roman" w:hAnsi="Times New Roman" w:cs="Times New Roman"/>
+                <w:sz w:val="28"/>
+                <w:szCs w:val="28"/>
+              </w:rPr>
+              <w:t>010</w:t>
+            </w:r>
+          </w:p>
+          <w:p>
+            <w:pPr>
+              <w:spacing w:after="0" w:line="240" w:lineRule="auto"/>
+              <w:rPr>
+                <w:rFonts w:ascii="Times New Roman" w:hAnsi="Times New Roman" w:cs="Times New Roman"/>
+                <w:sz w:val="28"/>
+                <w:szCs w:val="28"/>
+              </w:rPr>
+            </w:pPr>
+            <w:r>
+              <w:rPr>
+                <w:rFonts w:ascii="Times New Roman" w:hAnsi="Times New Roman" w:cs="Times New Roman"/>
+                <w:sz w:val="28"/>
+                <w:szCs w:val="28"/>
+              </w:rPr>
+              <w:t>010</w:t>
+            </w:r>
+          </w:p>
+        </w:tc>
+        <w:tc>
+          <w:tcPr>
+            <w:tcW w:w="5103" w:type="dxa"/>
+            <w:vAlign w:val="center"/>
+          </w:tcPr>
+          <w:p>
+            <w:pPr>
+              <w:spacing w:after="0" w:line="240" w:lineRule="auto"/>
+              <w:rPr>
+                <w:rFonts w:ascii="Times New Roman" w:hAnsi="Times New Roman" w:cs="Times New Roman"/>
+                <w:sz w:val="28"/>
+                <w:szCs w:val="28"/>
+                <w:lang w:val="en-US"/>
+              </w:rPr>
+            </w:pPr>
+            <w:r>
+              <w:rPr>
+                <w:rFonts w:ascii="Times New Roman" w:hAnsi="Times New Roman" w:cs="Times New Roman"/>
+                <w:sz w:val="28"/>
+                <w:szCs w:val="28"/>
+                <w:lang w:val="en-US"/>
+              </w:rPr>
+              <w:t>0</w:t>
+            </w:r>
+          </w:p>
+        </w:tc>
+      </w:tr>
+      <w:tr>
+        <w:trPr>
+          <w:trHeight w:val="454"/>
+        </w:trPr>
+        <w:tc>
+          <w:tcPr>
+            <w:tcW w:w="4361" w:type="dxa"/>
+            <w:tcBorders>
+              <w:bottom w:val="single" w:sz="4" w:space="0" w:color="auto"/>
+            </w:tcBorders>
+            <w:vAlign w:val="center"/>
+          </w:tcPr>
+          <w:p>
+            <w:pPr>
+              <w:spacing w:after="0" w:line="240" w:lineRule="auto"/>
+              <w:rPr>
+                <w:rFonts w:ascii="Times New Roman" w:hAnsi="Times New Roman" w:cs="Times New Roman"/>
+                <w:sz w:val="28"/>
+                <w:szCs w:val="28"/>
+              </w:rPr>
+            </w:pPr>
+            <w:r>
+              <w:rPr>
+                <w:rFonts w:ascii="Times New Roman" w:hAnsi="Times New Roman" w:cs="Times New Roman"/>
+                <w:sz w:val="28"/>
+                <w:szCs w:val="28"/>
+              </w:rPr>
+              <w:t>5</w:t>
+            </w:r>
+          </w:p>
+          <w:p>
+            <w:pPr>
+              <w:spacing w:after="0" w:line="240" w:lineRule="auto"/>
+              <w:rPr>
+                <w:rFonts w:ascii="Times New Roman" w:hAnsi="Times New Roman" w:cs="Times New Roman"/>
+                <w:sz w:val="28"/>
+                <w:szCs w:val="28"/>
+              </w:rPr>
+            </w:pPr>
+            <w:r>
+              <w:rPr>
+                <w:rFonts w:ascii="Times New Roman" w:hAnsi="Times New Roman" w:cs="Times New Roman"/>
+                <w:sz w:val="28"/>
+                <w:szCs w:val="28"/>
+              </w:rPr>
+              <w:t>11001</w:t>
+            </w:r>
+          </w:p>
+          <w:p>
+            <w:pPr>
+              <w:spacing w:after="0" w:line="240" w:lineRule="auto"/>
+              <w:rPr>
+                <w:rFonts w:ascii="Times New Roman" w:hAnsi="Times New Roman" w:cs="Times New Roman"/>
+                <w:sz w:val="28"/>
+                <w:szCs w:val="28"/>
+                <w:lang w:val="en-US"/>
+              </w:rPr>
+            </w:pPr>
+            <w:r>
+              <w:rPr>
+                <w:rFonts w:ascii="Times New Roman" w:hAnsi="Times New Roman" w:cs="Times New Roman"/>
+                <w:sz w:val="28"/>
+                <w:szCs w:val="28"/>
+              </w:rPr>
+              <w:t>00000</w:t>
+            </w:r>
+          </w:p>
+        </w:tc>
+        <w:tc>
+          <w:tcPr>
+            <w:tcW w:w="5103" w:type="dxa"/>
+            <w:tcBorders>
+              <w:bottom w:val="single" w:sz="4" w:space="0" w:color="auto"/>
+            </w:tcBorders>
+            <w:vAlign w:val="center"/>
+          </w:tcPr>
+          <w:p>
+            <w:pPr>
+              <w:spacing w:after="0" w:line="240" w:lineRule="auto"/>
+              <w:rPr>
+                <w:rFonts w:ascii="Times New Roman" w:hAnsi="Times New Roman" w:cs="Times New Roman"/>
+                <w:sz w:val="28"/>
+                <w:szCs w:val="28"/>
+                <w:lang w:val="en-US"/>
+              </w:rPr>
+            </w:pPr>
+            <w:r>
+              <w:rPr>
+                <w:rFonts w:ascii="Times New Roman" w:hAnsi="Times New Roman" w:cs="Times New Roman"/>
+                <w:sz w:val="28"/>
+                <w:szCs w:val="28"/>
+                <w:lang w:val="en-US"/>
+              </w:rPr>
+              <w:t>0</w:t>
+            </w:r>
+          </w:p>
+        </w:tc>
+      </w:tr>
+      <w:tr>
+        <w:trPr>
+          <w:trHeight w:val="454"/>
+        </w:trPr>
+        <w:tc>
+          <w:tcPr>
+            <w:tcW w:w="4361" w:type="dxa"/>
+            <w:vAlign w:val="center"/>
+          </w:tcPr>
+          <w:p>
+            <w:pPr>
+              <w:spacing w:after="0" w:line="240" w:lineRule="auto"/>
+              <w:rPr>
+                <w:rFonts w:ascii="Times New Roman" w:hAnsi="Times New Roman" w:cs="Times New Roman"/>
+                <w:sz w:val="28"/>
+                <w:szCs w:val="28"/>
+                <w:lang w:val="en-US"/>
+              </w:rPr>
+            </w:pPr>
+            <w:r>
+              <w:rPr>
+                <w:rFonts w:ascii="Times New Roman" w:hAnsi="Times New Roman" w:cs="Times New Roman"/>
+                <w:sz w:val="28"/>
+                <w:szCs w:val="28"/>
+                <w:lang w:val="en-US"/>
+              </w:rPr>
+              <w:t>3</w:t>
+            </w:r>
+          </w:p>
+          <w:p>
+            <w:pPr>
+              <w:spacing w:after="0" w:line="240" w:lineRule="auto"/>
+              <w:rPr>
+                <w:rFonts w:ascii="Times New Roman" w:hAnsi="Times New Roman" w:cs="Times New Roman"/>
+                <w:sz w:val="28"/>
+                <w:szCs w:val="28"/>
+                <w:lang w:val="en-US"/>
+              </w:rPr>
+            </w:pPr>
+            <w:r>
+              <w:rPr>
+                <w:rFonts w:ascii="Times New Roman" w:hAnsi="Times New Roman" w:cs="Times New Roman"/>
+                <w:sz w:val="28"/>
+                <w:szCs w:val="28"/>
+                <w:lang w:val="en-US"/>
+              </w:rPr>
+              <w:t>0</w:t>
+            </w:r>
+            <w:r>
+              <w:rPr>
+                <w:rFonts w:ascii="Times New Roman" w:hAnsi="Times New Roman" w:cs="Times New Roman"/>
+                <w:sz w:val="28"/>
+                <w:szCs w:val="28"/>
+                <w:lang w:val="en-US"/>
+              </w:rPr>
+              <w:t>1</w:t>
+            </w:r>
+            <w:r>
+              <w:rPr>
+                <w:rFonts w:ascii="Times New Roman" w:hAnsi="Times New Roman" w:cs="Times New Roman"/>
+                <w:sz w:val="28"/>
+                <w:szCs w:val="28"/>
+                <w:lang w:val="en-US"/>
+              </w:rPr>
+              <w:t>0</w:t>
+            </w:r>
+          </w:p>
+          <w:p>
+            <w:pPr>
+              <w:spacing w:after="0" w:line="240" w:lineRule="auto"/>
+              <w:rPr>
+                <w:rFonts w:ascii="Times New Roman" w:hAnsi="Times New Roman" w:cs="Times New Roman"/>
+                <w:sz w:val="28"/>
+                <w:szCs w:val="28"/>
+                <w:lang w:val="en-US"/>
+              </w:rPr>
+            </w:pPr>
+            <w:r>
+              <w:rPr>
+                <w:rFonts w:ascii="Times New Roman" w:hAnsi="Times New Roman" w:cs="Times New Roman"/>
+                <w:sz w:val="28"/>
+                <w:szCs w:val="28"/>
+                <w:lang w:val="en-US"/>
+              </w:rPr>
+              <w:t>10</w:t>
+            </w:r>
+            <w:r>
+              <w:rPr>
+                <w:rFonts w:ascii="Times New Roman" w:hAnsi="Times New Roman" w:cs="Times New Roman"/>
+                <w:sz w:val="28"/>
+                <w:szCs w:val="28"/>
+                <w:lang w:val="en-US"/>
+              </w:rPr>
+              <w:t>1</w:t>
+            </w:r>
+          </w:p>
+        </w:tc>
+        <w:tc>
+          <w:tcPr>
+            <w:tcW w:w="5103" w:type="dxa"/>
+            <w:vAlign w:val="center"/>
+          </w:tcPr>
+          <w:p>
+            <w:pPr>
+              <w:spacing w:after="0" w:line="240" w:lineRule="auto"/>
+              <w:rPr>
+                <w:rFonts w:ascii="Times New Roman" w:hAnsi="Times New Roman" w:cs="Times New Roman"/>
+                <w:sz w:val="28"/>
+                <w:szCs w:val="28"/>
+                <w:lang w:val="en-US"/>
+              </w:rPr>
+            </w:pPr>
+            <w:r>
+              <w:rPr>
+                <w:rFonts w:ascii="Times New Roman" w:hAnsi="Times New Roman" w:cs="Times New Roman"/>
+                <w:sz w:val="28"/>
+                <w:szCs w:val="28"/>
+                <w:lang w:val="en-US"/>
+              </w:rPr>
+              <w:t>2</w:t>
+            </w:r>
+          </w:p>
+        </w:tc>
+      </w:tr>
+    </w:tbl>
+    <w:p>
+      <w:pPr>
+        <w:spacing w:after="160" w:line="259" w:lineRule="auto"/>
+        <w:rPr>
+          <w:rFonts w:ascii="Times New Roman" w:hAnsi="Times New Roman" w:cs="Times New Roman"/>
+          <w:b/>
+          <w:sz w:val="28"/>
+          <w:szCs w:val="28"/>
         </w:rPr>
       </w:pPr>
       <w:r>
@@ -10349,6 +12050,7 @@
         </w:rPr>
         <w:t xml:space="preserve">При выполнении работ, предусмотренных заданием на практику, в организации ФГБОУ ВО «Вятский государственный университет» мной, </w:t>
       </w:r>
+      <w:proofErr w:type="spellStart"/>
       <w:r>
         <w:rPr>
           <w:rFonts w:ascii="Times New Roman" w:eastAsia="Times New Roman" w:hAnsi="Times New Roman" w:cs="Times New Roman"/>
@@ -10356,7 +12058,17 @@
           <w:szCs w:val="28"/>
           <w:lang w:eastAsia="ru-RU"/>
         </w:rPr>
-        <w:t>Шильниковым Максимом Юрьевичем</w:t>
+        <w:t>Шильниковым</w:t>
+      </w:r>
+      <w:proofErr w:type="spellEnd"/>
+      <w:r>
+        <w:rPr>
+          <w:rFonts w:ascii="Times New Roman" w:eastAsia="Times New Roman" w:hAnsi="Times New Roman" w:cs="Times New Roman"/>
+          <w:sz w:val="28"/>
+          <w:szCs w:val="28"/>
+          <w:lang w:eastAsia="ru-RU"/>
+        </w:rPr>
+        <w:t xml:space="preserve"> Максимом Юрьевичем</w:t>
       </w:r>
       <w:r>
         <w:rPr>
@@ -10479,7 +12191,7 @@
         </w:rPr>
         <w:t xml:space="preserve">Python Software Foundation. – 2024. – Режим доступа: </w:t>
       </w:r>
-      <w:hyperlink r:id="rId25" w:tgtFrame="_blank" w:history="1">
+      <w:hyperlink r:id="rId27" w:tgtFrame="_blank" w:history="1">
         <w:r>
           <w:rPr>
             <w:rStyle w:val="af6"/>
@@ -10547,13 +12259,41 @@
           <w:szCs w:val="28"/>
         </w:rPr>
       </w:pPr>
-      <w:r>
-        <w:rPr>
-          <w:rFonts w:ascii="Times New Roman" w:hAnsi="Times New Roman" w:cs="Times New Roman"/>
-          <w:sz w:val="28"/>
-          <w:szCs w:val="28"/>
-        </w:rPr>
-        <w:t>JetBrains. Руководство по началу работы с PyCharm [Электронный ресурс]</w:t>
+      <w:proofErr w:type="spellStart"/>
+      <w:r>
+        <w:rPr>
+          <w:rFonts w:ascii="Times New Roman" w:hAnsi="Times New Roman" w:cs="Times New Roman"/>
+          <w:sz w:val="28"/>
+          <w:szCs w:val="28"/>
+        </w:rPr>
+        <w:t>JetBrains</w:t>
+      </w:r>
+      <w:proofErr w:type="spellEnd"/>
+      <w:r>
+        <w:rPr>
+          <w:rFonts w:ascii="Times New Roman" w:hAnsi="Times New Roman" w:cs="Times New Roman"/>
+          <w:sz w:val="28"/>
+          <w:szCs w:val="28"/>
+        </w:rPr>
+        <w:t xml:space="preserve">. Руководство по началу работы с </w:t>
+      </w:r>
+      <w:proofErr w:type="spellStart"/>
+      <w:r>
+        <w:rPr>
+          <w:rFonts w:ascii="Times New Roman" w:hAnsi="Times New Roman" w:cs="Times New Roman"/>
+          <w:sz w:val="28"/>
+          <w:szCs w:val="28"/>
+        </w:rPr>
+        <w:t>PyCharm</w:t>
+      </w:r>
+      <w:proofErr w:type="spellEnd"/>
+      <w:r>
+        <w:rPr>
+          <w:rFonts w:ascii="Times New Roman" w:hAnsi="Times New Roman" w:cs="Times New Roman"/>
+          <w:sz w:val="28"/>
+          <w:szCs w:val="28"/>
+        </w:rPr>
+        <w:t xml:space="preserve"> [Электронный ресурс]</w:t>
       </w:r>
       <w:r>
         <w:rPr>
@@ -10579,15 +12319,25 @@
         </w:rPr>
         <w:t> </w:t>
       </w:r>
-      <w:r>
-        <w:rPr>
-          <w:rFonts w:ascii="Times New Roman" w:hAnsi="Times New Roman" w:cs="Times New Roman"/>
-          <w:sz w:val="28"/>
-          <w:szCs w:val="28"/>
-        </w:rPr>
-        <w:t xml:space="preserve">JetBrains. – 2023. – Режим доступа: </w:t>
-      </w:r>
-      <w:hyperlink r:id="rId26" w:tgtFrame="_blank" w:history="1">
+      <w:proofErr w:type="spellStart"/>
+      <w:r>
+        <w:rPr>
+          <w:rFonts w:ascii="Times New Roman" w:hAnsi="Times New Roman" w:cs="Times New Roman"/>
+          <w:sz w:val="28"/>
+          <w:szCs w:val="28"/>
+        </w:rPr>
+        <w:t>JetBrains</w:t>
+      </w:r>
+      <w:proofErr w:type="spellEnd"/>
+      <w:r>
+        <w:rPr>
+          <w:rFonts w:ascii="Times New Roman" w:hAnsi="Times New Roman" w:cs="Times New Roman"/>
+          <w:sz w:val="28"/>
+          <w:szCs w:val="28"/>
+        </w:rPr>
+        <w:t xml:space="preserve">. – 2023. – Режим доступа: </w:t>
+      </w:r>
+      <w:hyperlink r:id="rId28" w:tgtFrame="_blank" w:history="1">
         <w:r>
           <w:rPr>
             <w:rStyle w:val="af6"/>
@@ -10671,15 +12421,79 @@
           <w:szCs w:val="28"/>
         </w:rPr>
       </w:pPr>
-      <w:r>
-        <w:rPr>
-          <w:rFonts w:ascii="Times New Roman" w:hAnsi="Times New Roman" w:cs="Times New Roman"/>
-          <w:sz w:val="28"/>
-          <w:szCs w:val="28"/>
-        </w:rPr>
-        <w:t xml:space="preserve">JetBrains. PyCharm Documentation [Электронный ресурс] / JetBrains. – 2024. – Режим доступа: </w:t>
-      </w:r>
-      <w:hyperlink r:id="rId27" w:tgtFrame="_blank" w:history="1">
+      <w:proofErr w:type="spellStart"/>
+      <w:r>
+        <w:rPr>
+          <w:rFonts w:ascii="Times New Roman" w:hAnsi="Times New Roman" w:cs="Times New Roman"/>
+          <w:sz w:val="28"/>
+          <w:szCs w:val="28"/>
+        </w:rPr>
+        <w:t>JetBrains</w:t>
+      </w:r>
+      <w:proofErr w:type="spellEnd"/>
+      <w:r>
+        <w:rPr>
+          <w:rFonts w:ascii="Times New Roman" w:hAnsi="Times New Roman" w:cs="Times New Roman"/>
+          <w:sz w:val="28"/>
+          <w:szCs w:val="28"/>
+        </w:rPr>
+        <w:t xml:space="preserve">. </w:t>
+      </w:r>
+      <w:proofErr w:type="spellStart"/>
+      <w:r>
+        <w:rPr>
+          <w:rFonts w:ascii="Times New Roman" w:hAnsi="Times New Roman" w:cs="Times New Roman"/>
+          <w:sz w:val="28"/>
+          <w:szCs w:val="28"/>
+        </w:rPr>
+        <w:t>PyCharm</w:t>
+      </w:r>
+      <w:proofErr w:type="spellEnd"/>
+      <w:r>
+        <w:rPr>
+          <w:rFonts w:ascii="Times New Roman" w:hAnsi="Times New Roman" w:cs="Times New Roman"/>
+          <w:sz w:val="28"/>
+          <w:szCs w:val="28"/>
+        </w:rPr>
+        <w:t xml:space="preserve"> </w:t>
+      </w:r>
+      <w:proofErr w:type="spellStart"/>
+      <w:r>
+        <w:rPr>
+          <w:rFonts w:ascii="Times New Roman" w:hAnsi="Times New Roman" w:cs="Times New Roman"/>
+          <w:sz w:val="28"/>
+          <w:szCs w:val="28"/>
+        </w:rPr>
+        <w:t>Documentation</w:t>
+      </w:r>
+      <w:proofErr w:type="spellEnd"/>
+      <w:r>
+        <w:rPr>
+          <w:rFonts w:ascii="Times New Roman" w:hAnsi="Times New Roman" w:cs="Times New Roman"/>
+          <w:sz w:val="28"/>
+          <w:szCs w:val="28"/>
+        </w:rPr>
+        <w:t xml:space="preserve"> [Электронный ресурс] / </w:t>
+      </w:r>
+      <w:proofErr w:type="spellStart"/>
+      <w:r>
+        <w:rPr>
+          <w:rFonts w:ascii="Times New Roman" w:hAnsi="Times New Roman" w:cs="Times New Roman"/>
+          <w:sz w:val="28"/>
+          <w:szCs w:val="28"/>
+        </w:rPr>
+        <w:t>JetBrains</w:t>
+      </w:r>
+      <w:proofErr w:type="spellEnd"/>
+      <w:r>
+        <w:rPr>
+          <w:rFonts w:ascii="Times New Roman" w:hAnsi="Times New Roman" w:cs="Times New Roman"/>
+          <w:sz w:val="28"/>
+          <w:szCs w:val="28"/>
+        </w:rPr>
+        <w:t xml:space="preserve">. – 2024. – Режим доступа: </w:t>
+      </w:r>
+      <w:hyperlink r:id="rId29" w:tgtFrame="_blank" w:history="1">
         <w:r>
           <w:rPr>
             <w:rStyle w:val="af6"/>
@@ -10769,7 +12583,25 @@
           <w:sz w:val="28"/>
           <w:szCs w:val="28"/>
         </w:rPr>
-        <w:t>Доусон, М. Программируем на Python / М. Доусон. – 8-е изд. – СПб. : Питер, 2023. – 416 с. – ISBN 978-5-4461-2594-8</w:t>
+        <w:t>Доусон, М. Программируем на Python / М. Доусон. – 8-е изд. – СПб</w:t>
+      </w:r>
+      <w:proofErr w:type="gramStart"/>
+      <w:r>
+        <w:rPr>
+          <w:rFonts w:ascii="Times New Roman" w:hAnsi="Times New Roman" w:cs="Times New Roman"/>
+          <w:sz w:val="28"/>
+          <w:szCs w:val="28"/>
+        </w:rPr>
+        <w:t>. :</w:t>
+      </w:r>
+      <w:proofErr w:type="gramEnd"/>
+      <w:r>
+        <w:rPr>
+          <w:rFonts w:ascii="Times New Roman" w:hAnsi="Times New Roman" w:cs="Times New Roman"/>
+          <w:sz w:val="28"/>
+          <w:szCs w:val="28"/>
+        </w:rPr>
+        <w:t xml:space="preserve"> Питер, 2023. – 416 с. – ISBN 978-5-4461-2594-8</w:t>
       </w:r>
       <w:r>
         <w:rPr>
@@ -10796,13 +12628,59 @@
           <w:szCs w:val="28"/>
         </w:rPr>
       </w:pPr>
-      <w:r>
-        <w:rPr>
-          <w:rFonts w:ascii="Times New Roman" w:hAnsi="Times New Roman" w:cs="Times New Roman"/>
-          <w:sz w:val="28"/>
-          <w:szCs w:val="28"/>
-        </w:rPr>
-        <w:t>Вордерман, К. Программирование на Python: иллюстрированное руководство для детей / К. Вордерман. – М. : Эксмо, 2021. – 224 с. – ISBN 978-5-699-99833</w:t>
+      <w:proofErr w:type="spellStart"/>
+      <w:r>
+        <w:rPr>
+          <w:rFonts w:ascii="Times New Roman" w:hAnsi="Times New Roman" w:cs="Times New Roman"/>
+          <w:sz w:val="28"/>
+          <w:szCs w:val="28"/>
+        </w:rPr>
+        <w:t>Вордерман</w:t>
+      </w:r>
+      <w:proofErr w:type="spellEnd"/>
+      <w:r>
+        <w:rPr>
+          <w:rFonts w:ascii="Times New Roman" w:hAnsi="Times New Roman" w:cs="Times New Roman"/>
+          <w:sz w:val="28"/>
+          <w:szCs w:val="28"/>
+        </w:rPr>
+        <w:t xml:space="preserve">, К. Программирование на Python: иллюстрированное руководство для детей / К. </w:t>
+      </w:r>
+      <w:proofErr w:type="spellStart"/>
+      <w:r>
+        <w:rPr>
+          <w:rFonts w:ascii="Times New Roman" w:hAnsi="Times New Roman" w:cs="Times New Roman"/>
+          <w:sz w:val="28"/>
+          <w:szCs w:val="28"/>
+        </w:rPr>
+        <w:t>Вордерман</w:t>
+      </w:r>
+      <w:proofErr w:type="spellEnd"/>
+      <w:r>
+        <w:rPr>
+          <w:rFonts w:ascii="Times New Roman" w:hAnsi="Times New Roman" w:cs="Times New Roman"/>
+          <w:sz w:val="28"/>
+          <w:szCs w:val="28"/>
+        </w:rPr>
+        <w:t xml:space="preserve">. – </w:t>
+      </w:r>
+      <w:proofErr w:type="gramStart"/>
+      <w:r>
+        <w:rPr>
+          <w:rFonts w:ascii="Times New Roman" w:hAnsi="Times New Roman" w:cs="Times New Roman"/>
+          <w:sz w:val="28"/>
+          <w:szCs w:val="28"/>
+        </w:rPr>
+        <w:t>М. :</w:t>
+      </w:r>
+      <w:proofErr w:type="gramEnd"/>
+      <w:r>
+        <w:rPr>
+          <w:rFonts w:ascii="Times New Roman" w:hAnsi="Times New Roman" w:cs="Times New Roman"/>
+          <w:sz w:val="28"/>
+          <w:szCs w:val="28"/>
+        </w:rPr>
+        <w:t xml:space="preserve"> Эксмо, 2021. – 224 с. – ISBN 978-5-699-99833</w:t>
       </w:r>
       <w:r>
         <w:rPr>
@@ -10835,7 +12713,25 @@
           <w:sz w:val="28"/>
           <w:szCs w:val="28"/>
         </w:rPr>
-        <w:t>Бизли, Д. Python. Подробный справочник / Д. Бизли. – 6-е изд. – СПб. : Диалектика, 2020. – 608 с. – ISBN 978-5-907144-76-0</w:t>
+        <w:t>Бизли, Д. Python. Подробный справочник / Д. Бизли. – 6-е изд. – СПб</w:t>
+      </w:r>
+      <w:proofErr w:type="gramStart"/>
+      <w:r>
+        <w:rPr>
+          <w:rFonts w:ascii="Times New Roman" w:hAnsi="Times New Roman" w:cs="Times New Roman"/>
+          <w:sz w:val="28"/>
+          <w:szCs w:val="28"/>
+        </w:rPr>
+        <w:t>. :</w:t>
+      </w:r>
+      <w:proofErr w:type="gramEnd"/>
+      <w:r>
+        <w:rPr>
+          <w:rFonts w:ascii="Times New Roman" w:hAnsi="Times New Roman" w:cs="Times New Roman"/>
+          <w:sz w:val="28"/>
+          <w:szCs w:val="28"/>
+        </w:rPr>
+        <w:t xml:space="preserve"> Диалектика, 2020. – 608 с. – ISBN 978-5-907144-76-0</w:t>
       </w:r>
       <w:r>
         <w:rPr>
@@ -11003,7 +12899,7 @@
                     <pic:cNvPicPr/>
                   </pic:nvPicPr>
                   <pic:blipFill>
-                    <a:blip r:embed="rId28">
+                    <a:blip r:embed="rId30">
                       <a:extLst>
                         <a:ext uri="{28A0092B-C50C-407E-A947-70E740481C1C}">
                           <a14:useLocalDpi xmlns:a14="http://schemas.microsoft.com/office/drawing/2010/main" val="0"/>
@@ -11114,7 +13010,7 @@
                     <pic:cNvPicPr/>
                   </pic:nvPicPr>
                   <pic:blipFill rotWithShape="1">
-                    <a:blip r:embed="rId29"/>
+                    <a:blip r:embed="rId31"/>
                     <a:srcRect r="8400"/>
                     <a:stretch>
                       <a:fillRect/>
@@ -11243,7 +13139,7 @@
                     <pic:cNvPicPr/>
                   </pic:nvPicPr>
                   <pic:blipFill rotWithShape="1">
-                    <a:blip r:embed="rId30"/>
+                    <a:blip r:embed="rId32"/>
                     <a:srcRect r="2243"/>
                     <a:stretch>
                       <a:fillRect/>
@@ -11331,7 +13227,27 @@
           <w:sz w:val="28"/>
           <w:szCs w:val="28"/>
         </w:rPr>
-        <w:t xml:space="preserve">. Скибидус и </w:t>
+        <w:t xml:space="preserve">. </w:t>
+      </w:r>
+      <w:proofErr w:type="spellStart"/>
+      <w:r>
+        <w:rPr>
+          <w:rFonts w:ascii="Times New Roman" w:hAnsi="Times New Roman" w:cs="Times New Roman"/>
+          <w:bCs/>
+          <w:sz w:val="28"/>
+          <w:szCs w:val="28"/>
+        </w:rPr>
+        <w:t>Скибидус</w:t>
+      </w:r>
+      <w:proofErr w:type="spellEnd"/>
+      <w:r>
+        <w:rPr>
+          <w:rFonts w:ascii="Times New Roman" w:hAnsi="Times New Roman" w:cs="Times New Roman"/>
+          <w:bCs/>
+          <w:sz w:val="28"/>
+          <w:szCs w:val="28"/>
+        </w:rPr>
+        <w:t xml:space="preserve"> и </w:t>
       </w:r>
       <w:r>
         <w:rPr>
@@ -11406,7 +13322,7 @@
                     <pic:cNvPicPr/>
                   </pic:nvPicPr>
                   <pic:blipFill>
-                    <a:blip r:embed="rId31"/>
+                    <a:blip r:embed="rId33"/>
                     <a:stretch>
                       <a:fillRect/>
                     </a:stretch>
@@ -11427,9 +13343,137 @@
         </w:drawing>
       </w:r>
     </w:p>
+    <w:p>
+      <w:pPr>
+        <w:spacing w:after="160" w:line="259" w:lineRule="auto"/>
+        <w:rPr>
+          <w:rFonts w:ascii="Times New Roman" w:hAnsi="Times New Roman" w:cs="Times New Roman"/>
+          <w:b/>
+          <w:sz w:val="32"/>
+          <w:szCs w:val="32"/>
+          <w:lang w:val="en-US"/>
+        </w:rPr>
+      </w:pPr>
+      <w:r>
+        <w:rPr>
+          <w:rFonts w:ascii="Times New Roman" w:hAnsi="Times New Roman" w:cs="Times New Roman"/>
+          <w:b/>
+          <w:sz w:val="32"/>
+          <w:szCs w:val="32"/>
+          <w:lang w:val="en-US"/>
+        </w:rPr>
+        <w:br w:type="page"/>
+      </w:r>
+    </w:p>
+    <w:p>
+      <w:pPr>
+        <w:jc w:val="both"/>
+        <w:rPr>
+          <w:rFonts w:ascii="Times New Roman" w:hAnsi="Times New Roman" w:cs="Times New Roman"/>
+          <w:bCs/>
+          <w:sz w:val="28"/>
+          <w:szCs w:val="28"/>
+          <w:lang w:val="en-US"/>
+        </w:rPr>
+      </w:pPr>
+      <w:r>
+        <w:rPr>
+          <w:rFonts w:ascii="Times New Roman" w:hAnsi="Times New Roman" w:cs="Times New Roman"/>
+          <w:bCs/>
+          <w:sz w:val="28"/>
+          <w:szCs w:val="28"/>
+        </w:rPr>
+        <w:lastRenderedPageBreak/>
+        <w:t xml:space="preserve">Задача </w:t>
+      </w:r>
+      <w:r>
+        <w:rPr>
+          <w:rFonts w:ascii="Times New Roman" w:hAnsi="Times New Roman" w:cs="Times New Roman"/>
+          <w:bCs/>
+          <w:sz w:val="28"/>
+          <w:szCs w:val="28"/>
+          <w:lang w:val="en-US"/>
+        </w:rPr>
+        <w:t>D</w:t>
+      </w:r>
+      <w:r>
+        <w:rPr>
+          <w:rFonts w:ascii="Times New Roman" w:hAnsi="Times New Roman" w:cs="Times New Roman"/>
+          <w:bCs/>
+          <w:sz w:val="28"/>
+          <w:szCs w:val="28"/>
+        </w:rPr>
+        <w:t>. Грегор и игра в пешки.</w:t>
+      </w:r>
+    </w:p>
+    <w:p>
+      <w:pPr>
+        <w:jc w:val="both"/>
+        <w:rPr>
+          <w:rFonts w:ascii="Times New Roman" w:hAnsi="Times New Roman" w:cs="Times New Roman"/>
+          <w:bCs/>
+          <w:sz w:val="28"/>
+          <w:szCs w:val="28"/>
+          <w:lang w:val="en-US"/>
+        </w:rPr>
+      </w:pPr>
+      <w:r>
+        <w:rPr>
+          <w:rFonts w:ascii="Times New Roman" w:hAnsi="Times New Roman" w:cs="Times New Roman"/>
+          <w:bCs/>
+          <w:sz w:val="28"/>
+          <w:szCs w:val="28"/>
+          <w:lang w:val="en-US"/>
+        </w:rPr>
+        <w:drawing>
+          <wp:inline distT="0" distB="0" distL="0" distR="0" wp14:anchorId="0A60C6A7" wp14:editId="2C422C75">
+            <wp:extent cx="6373401" cy="7015655"/>
+            <wp:effectExtent l="0" t="0" r="8890" b="0"/>
+            <wp:docPr id="40603507" name="Рисунок 1"/>
+            <wp:cNvGraphicFramePr>
+              <a:graphicFrameLocks xmlns:a="http://schemas.openxmlformats.org/drawingml/2006/main" noChangeAspect="1"/>
+            </wp:cNvGraphicFramePr>
+            <a:graphic xmlns:a="http://schemas.openxmlformats.org/drawingml/2006/main">
+              <a:graphicData uri="http://schemas.openxmlformats.org/drawingml/2006/picture">
+                <pic:pic xmlns:pic="http://schemas.openxmlformats.org/drawingml/2006/picture">
+                  <pic:nvPicPr>
+                    <pic:cNvPr id="40603507" name=""/>
+                    <pic:cNvPicPr/>
+                  </pic:nvPicPr>
+                  <pic:blipFill rotWithShape="1">
+                    <a:blip r:embed="rId34"/>
+                    <a:srcRect r="4276"/>
+                    <a:stretch>
+                      <a:fillRect/>
+                    </a:stretch>
+                  </pic:blipFill>
+                  <pic:spPr bwMode="auto">
+                    <a:xfrm>
+                      <a:off x="0" y="0"/>
+                      <a:ext cx="6425678" cy="7073200"/>
+                    </a:xfrm>
+                    <a:prstGeom prst="rect">
+                      <a:avLst/>
+                    </a:prstGeom>
+                    <a:ln>
+                      <a:noFill/>
+                    </a:ln>
+                    <a:extLst>
+                      <a:ext uri="{53640926-AAD7-44D8-BBD7-CCE9431645EC}">
+                        <a14:shadowObscured xmlns:a14="http://schemas.microsoft.com/office/drawing/2010/main"/>
+                      </a:ext>
+                    </a:extLst>
+                  </pic:spPr>
+                </pic:pic>
+              </a:graphicData>
+            </a:graphic>
+          </wp:inline>
+        </w:drawing>
+      </w:r>
+    </w:p>
     <w:sectPr>
-      <w:footerReference w:type="default" r:id="rId32"/>
-      <w:footerReference w:type="first" r:id="rId33"/>
+      <w:footerReference w:type="default" r:id="rId35"/>
+      <w:footerReference w:type="first" r:id="rId36"/>
       <w:pgSz w:w="11906" w:h="16838"/>
       <w:pgMar w:top="1134" w:right="707" w:bottom="1134" w:left="1701" w:header="709" w:footer="709" w:gutter="0"/>
       <w:pgNumType w:start="2"/>
@@ -12554,6 +14598,155 @@
     </w:lvl>
   </w:abstractNum>
   <w:abstractNum w:abstractNumId="8" w15:restartNumberingAfterBreak="0">
+    <w:nsid w:val="449268C6"/>
+    <w:multiLevelType w:val="multilevel"/>
+    <w:tmpl w:val="788C04F4"/>
+    <w:lvl w:ilvl="0">
+      <w:start w:val="1"/>
+      <w:numFmt w:val="bullet"/>
+      <w:lvlText w:val=""/>
+      <w:lvlJc w:val="left"/>
+      <w:pPr>
+        <w:tabs>
+          <w:tab w:val="num" w:pos="720"/>
+        </w:tabs>
+        <w:ind w:left="720" w:hanging="360"/>
+      </w:pPr>
+      <w:rPr>
+        <w:rFonts w:ascii="Symbol" w:hAnsi="Symbol" w:hint="default"/>
+        <w:sz w:val="20"/>
+      </w:rPr>
+    </w:lvl>
+    <w:lvl w:ilvl="1" w:tentative="1">
+      <w:start w:val="1"/>
+      <w:numFmt w:val="bullet"/>
+      <w:lvlText w:val="o"/>
+      <w:lvlJc w:val="left"/>
+      <w:pPr>
+        <w:tabs>
+          <w:tab w:val="num" w:pos="1440"/>
+        </w:tabs>
+        <w:ind w:left="1440" w:hanging="360"/>
+      </w:pPr>
+      <w:rPr>
+        <w:rFonts w:ascii="Courier New" w:hAnsi="Courier New" w:hint="default"/>
+        <w:sz w:val="20"/>
+      </w:rPr>
+    </w:lvl>
+    <w:lvl w:ilvl="2" w:tentative="1">
+      <w:start w:val="1"/>
+      <w:numFmt w:val="bullet"/>
+      <w:lvlText w:val=""/>
+      <w:lvlJc w:val="left"/>
+      <w:pPr>
+        <w:tabs>
+          <w:tab w:val="num" w:pos="2160"/>
+        </w:tabs>
+        <w:ind w:left="2160" w:hanging="360"/>
+      </w:pPr>
+      <w:rPr>
+        <w:rFonts w:ascii="Wingdings" w:hAnsi="Wingdings" w:hint="default"/>
+        <w:sz w:val="20"/>
+      </w:rPr>
+    </w:lvl>
+    <w:lvl w:ilvl="3" w:tentative="1">
+      <w:start w:val="1"/>
+      <w:numFmt w:val="bullet"/>
+      <w:lvlText w:val=""/>
+      <w:lvlJc w:val="left"/>
+      <w:pPr>
+        <w:tabs>
+          <w:tab w:val="num" w:pos="2880"/>
+        </w:tabs>
+        <w:ind w:left="2880" w:hanging="360"/>
+      </w:pPr>
+      <w:rPr>
+        <w:rFonts w:ascii="Wingdings" w:hAnsi="Wingdings" w:hint="default"/>
+        <w:sz w:val="20"/>
+      </w:rPr>
+    </w:lvl>
+    <w:lvl w:ilvl="4" w:tentative="1">
+      <w:start w:val="1"/>
+      <w:numFmt w:val="bullet"/>
+      <w:lvlText w:val=""/>
+      <w:lvlJc w:val="left"/>
+      <w:pPr>
+        <w:tabs>
+          <w:tab w:val="num" w:pos="3600"/>
+        </w:tabs>
+        <w:ind w:left="3600" w:hanging="360"/>
+      </w:pPr>
+      <w:rPr>
+        <w:rFonts w:ascii="Wingdings" w:hAnsi="Wingdings" w:hint="default"/>
+        <w:sz w:val="20"/>
+      </w:rPr>
+    </w:lvl>
+    <w:lvl w:ilvl="5" w:tentative="1">
+      <w:start w:val="1"/>
+      <w:numFmt w:val="bullet"/>
+      <w:lvlText w:val=""/>
+      <w:lvlJc w:val="left"/>
+      <w:pPr>
+        <w:tabs>
+          <w:tab w:val="num" w:pos="4320"/>
+        </w:tabs>
+        <w:ind w:left="4320" w:hanging="360"/>
+      </w:pPr>
+      <w:rPr>
+        <w:rFonts w:ascii="Wingdings" w:hAnsi="Wingdings" w:hint="default"/>
+        <w:sz w:val="20"/>
+      </w:rPr>
+    </w:lvl>
+    <w:lvl w:ilvl="6" w:tentative="1">
+      <w:start w:val="1"/>
+      <w:numFmt w:val="bullet"/>
+      <w:lvlText w:val=""/>
+      <w:lvlJc w:val="left"/>
+      <w:pPr>
+        <w:tabs>
+          <w:tab w:val="num" w:pos="5040"/>
+        </w:tabs>
+        <w:ind w:left="5040" w:hanging="360"/>
+      </w:pPr>
+      <w:rPr>
+        <w:rFonts w:ascii="Wingdings" w:hAnsi="Wingdings" w:hint="default"/>
+        <w:sz w:val="20"/>
+      </w:rPr>
+    </w:lvl>
+    <w:lvl w:ilvl="7" w:tentative="1">
+      <w:start w:val="1"/>
+      <w:numFmt w:val="bullet"/>
+      <w:lvlText w:val=""/>
+      <w:lvlJc w:val="left"/>
+      <w:pPr>
+        <w:tabs>
+          <w:tab w:val="num" w:pos="5760"/>
+        </w:tabs>
+        <w:ind w:left="5760" w:hanging="360"/>
+      </w:pPr>
+      <w:rPr>
+        <w:rFonts w:ascii="Wingdings" w:hAnsi="Wingdings" w:hint="default"/>
+        <w:sz w:val="20"/>
+      </w:rPr>
+    </w:lvl>
+    <w:lvl w:ilvl="8" w:tentative="1">
+      <w:start w:val="1"/>
+      <w:numFmt w:val="bullet"/>
+      <w:lvlText w:val=""/>
+      <w:lvlJc w:val="left"/>
+      <w:pPr>
+        <w:tabs>
+          <w:tab w:val="num" w:pos="6480"/>
+        </w:tabs>
+        <w:ind w:left="6480" w:hanging="360"/>
+      </w:pPr>
+      <w:rPr>
+        <w:rFonts w:ascii="Wingdings" w:hAnsi="Wingdings" w:hint="default"/>
+        <w:sz w:val="20"/>
+      </w:rPr>
+    </w:lvl>
+  </w:abstractNum>
+  <w:abstractNum w:abstractNumId="9" w15:restartNumberingAfterBreak="0">
     <w:nsid w:val="46C81F45"/>
     <w:multiLevelType w:val="multilevel"/>
     <w:tmpl w:val="BDD65C36"/>
@@ -12702,7 +14895,96 @@
       </w:rPr>
     </w:lvl>
   </w:abstractNum>
-  <w:abstractNum w:abstractNumId="9" w15:restartNumberingAfterBreak="0">
+  <w:abstractNum w:abstractNumId="10" w15:restartNumberingAfterBreak="0">
+    <w:nsid w:val="6818263E"/>
+    <w:multiLevelType w:val="hybridMultilevel"/>
+    <w:tmpl w:val="056669A0"/>
+    <w:lvl w:ilvl="0" w:tplc="0419000F">
+      <w:start w:val="1"/>
+      <w:numFmt w:val="decimal"/>
+      <w:lvlText w:val="%1."/>
+      <w:lvlJc w:val="left"/>
+      <w:pPr>
+        <w:ind w:left="720" w:hanging="360"/>
+      </w:pPr>
+      <w:rPr>
+        <w:rFonts w:hint="default"/>
+      </w:rPr>
+    </w:lvl>
+    <w:lvl w:ilvl="1" w:tplc="04190019" w:tentative="1">
+      <w:start w:val="1"/>
+      <w:numFmt w:val="lowerLetter"/>
+      <w:lvlText w:val="%2."/>
+      <w:lvlJc w:val="left"/>
+      <w:pPr>
+        <w:ind w:left="1440" w:hanging="360"/>
+      </w:pPr>
+    </w:lvl>
+    <w:lvl w:ilvl="2" w:tplc="0419001B" w:tentative="1">
+      <w:start w:val="1"/>
+      <w:numFmt w:val="lowerRoman"/>
+      <w:lvlText w:val="%3."/>
+      <w:lvlJc w:val="right"/>
+      <w:pPr>
+        <w:ind w:left="2160" w:hanging="180"/>
+      </w:pPr>
+    </w:lvl>
+    <w:lvl w:ilvl="3" w:tplc="0419000F" w:tentative="1">
+      <w:start w:val="1"/>
+      <w:numFmt w:val="decimal"/>
+      <w:lvlText w:val="%4."/>
+      <w:lvlJc w:val="left"/>
+      <w:pPr>
+        <w:ind w:left="2880" w:hanging="360"/>
+      </w:pPr>
+    </w:lvl>
+    <w:lvl w:ilvl="4" w:tplc="04190019" w:tentative="1">
+      <w:start w:val="1"/>
+      <w:numFmt w:val="lowerLetter"/>
+      <w:lvlText w:val="%5."/>
+      <w:lvlJc w:val="left"/>
+      <w:pPr>
+        <w:ind w:left="3600" w:hanging="360"/>
+      </w:pPr>
+    </w:lvl>
+    <w:lvl w:ilvl="5" w:tplc="0419001B" w:tentative="1">
+      <w:start w:val="1"/>
+      <w:numFmt w:val="lowerRoman"/>
+      <w:lvlText w:val="%6."/>
+      <w:lvlJc w:val="right"/>
+      <w:pPr>
+        <w:ind w:left="4320" w:hanging="180"/>
+      </w:pPr>
+    </w:lvl>
+    <w:lvl w:ilvl="6" w:tplc="0419000F" w:tentative="1">
+      <w:start w:val="1"/>
+      <w:numFmt w:val="decimal"/>
+      <w:lvlText w:val="%7."/>
+      <w:lvlJc w:val="left"/>
+      <w:pPr>
+        <w:ind w:left="5040" w:hanging="360"/>
+      </w:pPr>
+    </w:lvl>
+    <w:lvl w:ilvl="7" w:tplc="04190019" w:tentative="1">
+      <w:start w:val="1"/>
+      <w:numFmt w:val="lowerLetter"/>
+      <w:lvlText w:val="%8."/>
+      <w:lvlJc w:val="left"/>
+      <w:pPr>
+        <w:ind w:left="5760" w:hanging="360"/>
+      </w:pPr>
+    </w:lvl>
+    <w:lvl w:ilvl="8" w:tplc="0419001B" w:tentative="1">
+      <w:start w:val="1"/>
+      <w:numFmt w:val="lowerRoman"/>
+      <w:lvlText w:val="%9."/>
+      <w:lvlJc w:val="right"/>
+      <w:pPr>
+        <w:ind w:left="6480" w:hanging="180"/>
+      </w:pPr>
+    </w:lvl>
+  </w:abstractNum>
+  <w:abstractNum w:abstractNumId="11" w15:restartNumberingAfterBreak="0">
     <w:nsid w:val="689039F9"/>
     <w:multiLevelType w:val="hybridMultilevel"/>
     <w:tmpl w:val="B91AA14A"/>
@@ -12791,7 +15073,7 @@
       </w:pPr>
     </w:lvl>
   </w:abstractNum>
-  <w:abstractNum w:abstractNumId="10" w15:restartNumberingAfterBreak="0">
+  <w:abstractNum w:abstractNumId="12" w15:restartNumberingAfterBreak="0">
     <w:nsid w:val="7F604F38"/>
     <w:multiLevelType w:val="multilevel"/>
     <w:tmpl w:val="9544CB1C"/>
@@ -12947,25 +15229,31 @@
     <w:abstractNumId w:val="4"/>
   </w:num>
   <w:num w:numId="6" w16cid:durableId="1734044894">
-    <w:abstractNumId w:val="9"/>
+    <w:abstractNumId w:val="11"/>
   </w:num>
   <w:num w:numId="7" w16cid:durableId="408891161">
     <w:abstractNumId w:val="7"/>
   </w:num>
   <w:num w:numId="8" w16cid:durableId="1164659189">
-    <w:abstractNumId w:val="10"/>
+    <w:abstractNumId w:val="12"/>
   </w:num>
   <w:num w:numId="9" w16cid:durableId="1201162100">
     <w:abstractNumId w:val="6"/>
   </w:num>
   <w:num w:numId="10" w16cid:durableId="19668592">
-    <w:abstractNumId w:val="8"/>
+    <w:abstractNumId w:val="9"/>
   </w:num>
   <w:num w:numId="11" w16cid:durableId="1295912027">
     <w:abstractNumId w:val="1"/>
   </w:num>
   <w:num w:numId="12" w16cid:durableId="1934627343">
     <w:abstractNumId w:val="0"/>
+  </w:num>
+  <w:num w:numId="13" w16cid:durableId="877351155">
+    <w:abstractNumId w:val="8"/>
+  </w:num>
+  <w:num w:numId="14" w16cid:durableId="1960641038">
+    <w:abstractNumId w:val="10"/>
   </w:num>
 </w:numbering>
 </file>
@@ -13562,7 +15850,6 @@
   <w:style w:type="character" w:default="1" w:styleId="a0">
     <w:name w:val="Default Paragraph Font"/>
     <w:uiPriority w:val="1"/>
-    <w:semiHidden/>
     <w:unhideWhenUsed/>
   </w:style>
   <w:style w:type="table" w:default="1" w:styleId="a1">

</xml_diff>